<commit_message>
Update thesis figures, defence deck, and figure-generation scripts
- Regenerate publication-quality thesis figures (training curves,
  model comparison, correlation heatmap, distributions, missingness,
  transformer schematic, ROC/PR, SHAP, concordance)
- Fix concordance to use TreeSHAP variable-level values (phi_pv) vs SOFA
- Add scripts to embed figures into thesis.docx and defence pptx
- Update Chapter 2 figure references and captions
- Add defence deck assets and updated thesis/presentation outputs
- Ignore MS Office lock/temp files

Co-Authored-By: Claude Opus 4.8 <noreply@anthropic.com>
</commit_message>
<xml_diff>
--- a/thesis/thesis.docx
+++ b/thesis/thesis.docx
@@ -4171,95 +4171,95 @@
           <w:rFonts w:ascii="Times New Roman" w:hAnsi="Times New Roman" w:cs="Times New Roman"/>
         </w:rPr>
       </w:pPr>
-      <w:bookmarkStart w:id="0" w:name="national-research-tomsk-state-university"/>
-      <w:bookmarkStart w:id="1" w:name="_Toc229867173"/>
+      <w:bookmarkStart w:id="0" w:name="_Toc229867173"/>
+      <w:bookmarkStart w:id="1" w:name="national-research-tomsk-state-university"/>
       <w:r>
         <w:rPr>
           <w:rFonts w:ascii="Times New Roman" w:hAnsi="Times New Roman" w:cs="Times New Roman"/>
         </w:rPr>
         <w:t>NATIONAL RESEARCH TOMSK STATE UNIVERSITY</w:t>
       </w:r>
+      <w:bookmarkEnd w:id="0"/>
+    </w:p>
+    <w:p>
+      <w:pPr>
+        <w:pStyle w:val="Heading2"/>
+        <w:rPr>
+          <w:rFonts w:ascii="Times New Roman" w:hAnsi="Times New Roman" w:cs="Times New Roman"/>
+        </w:rPr>
+      </w:pPr>
+      <w:bookmarkStart w:id="2" w:name="_Toc229867174"/>
+      <w:bookmarkStart w:id="3" w:name="Xaa2e1ac4d49c749d8be909145c1f806432a4605"/>
+      <w:r>
+        <w:rPr>
+          <w:rFonts w:ascii="Times New Roman" w:hAnsi="Times New Roman" w:cs="Times New Roman"/>
+        </w:rPr>
+        <w:t xml:space="preserve">Faculty of Applied Mathematics and </w:t>
+      </w:r>
+      <w:r>
+        <w:rPr>
+          <w:rFonts w:ascii="Times New Roman" w:hAnsi="Times New Roman" w:cs="Times New Roman"/>
+        </w:rPr>
+        <w:t>Computer Science</w:t>
+      </w:r>
+      <w:bookmarkEnd w:id="2"/>
+    </w:p>
+    <w:p>
+      <w:pPr>
+        <w:pStyle w:val="Heading2"/>
+        <w:rPr>
+          <w:rFonts w:ascii="Times New Roman" w:hAnsi="Times New Roman" w:cs="Times New Roman"/>
+        </w:rPr>
+      </w:pPr>
+      <w:bookmarkStart w:id="4" w:name="X25588edc542d287e6b1c4977ca7b231c56408d6"/>
+      <w:bookmarkEnd w:id="3"/>
+      <w:r>
+        <w:rPr>
+          <w:rFonts w:ascii="Times New Roman" w:hAnsi="Times New Roman" w:cs="Times New Roman"/>
+        </w:rPr>
+        <w:t xml:space="preserve"> </w:t>
+      </w:r>
+    </w:p>
+    <w:p>
+      <w:pPr>
+        <w:rPr>
+          <w:rFonts w:ascii="Times New Roman" w:hAnsi="Times New Roman" w:cs="Times New Roman"/>
+        </w:rPr>
+      </w:pPr>
+      <w:r>
+        <w:rPr>
+          <w:rFonts w:ascii="Times New Roman" w:hAnsi="Times New Roman" w:cs="Times New Roman"/>
+        </w:rPr>
+        <w:pict w14:anchorId="61AB1235">
+          <v:rect id="_x0000_i1025" style="width:0;height:1.5pt" o:hralign="center" o:hrstd="t" o:hr="t"/>
+        </w:pict>
+      </w:r>
+    </w:p>
+    <w:p>
+      <w:pPr>
+        <w:pStyle w:val="Heading3"/>
+        <w:rPr>
+          <w:rFonts w:ascii="Times New Roman" w:hAnsi="Times New Roman" w:cs="Times New Roman"/>
+        </w:rPr>
+      </w:pPr>
+      <w:bookmarkStart w:id="5" w:name="masters-thesis"/>
+      <w:r>
+        <w:rPr>
+          <w:rFonts w:ascii="Times New Roman" w:hAnsi="Times New Roman" w:cs="Times New Roman"/>
+        </w:rPr>
+        <w:t>MASTER’S THESIS</w:t>
+      </w:r>
+    </w:p>
+    <w:p>
+      <w:pPr>
+        <w:pStyle w:val="Heading1"/>
+        <w:rPr>
+          <w:rFonts w:ascii="Times New Roman" w:hAnsi="Times New Roman" w:cs="Times New Roman"/>
+        </w:rPr>
+      </w:pPr>
+      <w:bookmarkStart w:id="6" w:name="_Toc229867175"/>
+      <w:bookmarkStart w:id="7" w:name="X7ca9abe5b96094ece7fe1b68bb076794cd2855c"/>
       <w:bookmarkEnd w:id="1"/>
-    </w:p>
-    <w:p>
-      <w:pPr>
-        <w:pStyle w:val="Heading2"/>
-        <w:rPr>
-          <w:rFonts w:ascii="Times New Roman" w:hAnsi="Times New Roman" w:cs="Times New Roman"/>
-        </w:rPr>
-      </w:pPr>
-      <w:bookmarkStart w:id="2" w:name="Xaa2e1ac4d49c749d8be909145c1f806432a4605"/>
-      <w:bookmarkStart w:id="3" w:name="_Toc229867174"/>
-      <w:r>
-        <w:rPr>
-          <w:rFonts w:ascii="Times New Roman" w:hAnsi="Times New Roman" w:cs="Times New Roman"/>
-        </w:rPr>
-        <w:t xml:space="preserve">Faculty of Applied Mathematics and </w:t>
-      </w:r>
-      <w:r>
-        <w:rPr>
-          <w:rFonts w:ascii="Times New Roman" w:hAnsi="Times New Roman" w:cs="Times New Roman"/>
-        </w:rPr>
-        <w:t>Computer Science</w:t>
-      </w:r>
-      <w:bookmarkEnd w:id="3"/>
-    </w:p>
-    <w:p>
-      <w:pPr>
-        <w:pStyle w:val="Heading2"/>
-        <w:rPr>
-          <w:rFonts w:ascii="Times New Roman" w:hAnsi="Times New Roman" w:cs="Times New Roman"/>
-        </w:rPr>
-      </w:pPr>
-      <w:bookmarkStart w:id="4" w:name="X25588edc542d287e6b1c4977ca7b231c56408d6"/>
-      <w:bookmarkEnd w:id="2"/>
-      <w:r>
-        <w:rPr>
-          <w:rFonts w:ascii="Times New Roman" w:hAnsi="Times New Roman" w:cs="Times New Roman"/>
-        </w:rPr>
-        <w:t xml:space="preserve"> </w:t>
-      </w:r>
-    </w:p>
-    <w:p>
-      <w:pPr>
-        <w:rPr>
-          <w:rFonts w:ascii="Times New Roman" w:hAnsi="Times New Roman" w:cs="Times New Roman"/>
-        </w:rPr>
-      </w:pPr>
-      <w:r>
-        <w:rPr>
-          <w:rFonts w:ascii="Times New Roman" w:hAnsi="Times New Roman" w:cs="Times New Roman"/>
-        </w:rPr>
-        <w:pict w14:anchorId="61AB1235">
-          <v:rect id="_x0000_i1055" style="width:0;height:1.5pt" o:hralign="center" o:hrstd="t" o:hr="t"/>
-        </w:pict>
-      </w:r>
-    </w:p>
-    <w:p>
-      <w:pPr>
-        <w:pStyle w:val="Heading3"/>
-        <w:rPr>
-          <w:rFonts w:ascii="Times New Roman" w:hAnsi="Times New Roman" w:cs="Times New Roman"/>
-        </w:rPr>
-      </w:pPr>
-      <w:bookmarkStart w:id="5" w:name="masters-thesis"/>
-      <w:r>
-        <w:rPr>
-          <w:rFonts w:ascii="Times New Roman" w:hAnsi="Times New Roman" w:cs="Times New Roman"/>
-        </w:rPr>
-        <w:t>MASTER’S THESIS</w:t>
-      </w:r>
-    </w:p>
-    <w:p>
-      <w:pPr>
-        <w:pStyle w:val="Heading1"/>
-        <w:rPr>
-          <w:rFonts w:ascii="Times New Roman" w:hAnsi="Times New Roman" w:cs="Times New Roman"/>
-        </w:rPr>
-      </w:pPr>
-      <w:bookmarkStart w:id="6" w:name="X7ca9abe5b96094ece7fe1b68bb076794cd2855c"/>
-      <w:bookmarkStart w:id="7" w:name="_Toc229867175"/>
-      <w:bookmarkEnd w:id="0"/>
       <w:bookmarkEnd w:id="4"/>
       <w:bookmarkEnd w:id="5"/>
       <w:r>
@@ -4268,7 +4268,7 @@
         </w:rPr>
         <w:t>Explainable Machine Learning for Mortality Prediction in Intensive Care Units: A Time-Step SHAP Attribution Approach on the PhysioNet 2012 Challenge Dataset</w:t>
       </w:r>
-      <w:bookmarkEnd w:id="7"/>
+      <w:bookmarkEnd w:id="6"/>
     </w:p>
     <w:p>
       <w:pPr>
@@ -4281,7 +4281,7 @@
           <w:rFonts w:ascii="Times New Roman" w:hAnsi="Times New Roman" w:cs="Times New Roman"/>
         </w:rPr>
         <w:pict w14:anchorId="7AE65876">
-          <v:rect id="_x0000_i1056" style="width:0;height:1.5pt" o:hralign="center" o:hrstd="t" o:hr="t"/>
+          <v:rect id="_x0000_i1026" style="width:0;height:1.5pt" o:hralign="center" o:hrstd="t" o:hr="t"/>
         </w:pict>
       </w:r>
     </w:p>
@@ -4365,7 +4365,7 @@
           <w:rFonts w:ascii="Times New Roman" w:hAnsi="Times New Roman" w:cs="Times New Roman"/>
         </w:rPr>
         <w:pict w14:anchorId="71DCA591">
-          <v:rect id="_x0000_i1057" style="width:0;height:1.5pt" o:hralign="center" o:hrstd="t" o:hr="t"/>
+          <v:rect id="_x0000_i1027" style="width:0;height:1.5pt" o:hralign="center" o:hrstd="t" o:hr="t"/>
         </w:pict>
       </w:r>
     </w:p>
@@ -4547,7 +4547,7 @@
           <w:rFonts w:ascii="Times New Roman" w:hAnsi="Times New Roman" w:cs="Times New Roman"/>
         </w:rPr>
         <w:pict w14:anchorId="38C8B1E0">
-          <v:rect id="_x0000_i1058" style="width:0;height:1.5pt" o:hralign="center" o:hrstd="t" o:hr="t"/>
+          <v:rect id="_x0000_i1028" style="width:0;height:1.5pt" o:hralign="center" o:hrstd="t" o:hr="t"/>
         </w:pict>
       </w:r>
     </w:p>
@@ -4662,7 +4662,7 @@
           <w:rFonts w:ascii="Times New Roman" w:hAnsi="Times New Roman" w:cs="Times New Roman"/>
         </w:rPr>
         <w:pict w14:anchorId="065C9E25">
-          <v:rect id="_x0000_i1059" style="width:0;height:1.5pt" o:hralign="center" o:hrstd="t" o:hr="t"/>
+          <v:rect id="_x0000_i1029" style="width:0;height:1.5pt" o:hralign="center" o:hrstd="t" o:hr="t"/>
         </w:pict>
       </w:r>
     </w:p>
@@ -4688,9 +4688,9 @@
           <w:color w:val="auto"/>
         </w:rPr>
       </w:pPr>
-      <w:bookmarkStart w:id="8" w:name="abstract"/>
-      <w:bookmarkStart w:id="9" w:name="_Toc229867176"/>
-      <w:bookmarkEnd w:id="6"/>
+      <w:bookmarkStart w:id="8" w:name="_Toc229867176"/>
+      <w:bookmarkStart w:id="9" w:name="abstract"/>
+      <w:bookmarkEnd w:id="7"/>
       <w:r>
         <w:rPr>
           <w:rFonts w:ascii="Times New Roman" w:hAnsi="Times New Roman" w:cs="Times New Roman"/>
@@ -4698,7 +4698,7 @@
         </w:rPr>
         <w:t>ABSTRACT</w:t>
       </w:r>
-      <w:bookmarkEnd w:id="9"/>
+      <w:bookmarkEnd w:id="8"/>
     </w:p>
     <w:p>
       <w:pPr>
@@ -4920,9 +4920,9 @@
           <w:color w:val="auto"/>
         </w:rPr>
       </w:pPr>
-      <w:bookmarkStart w:id="10" w:name="introduction"/>
-      <w:bookmarkStart w:id="11" w:name="_Toc229867177"/>
-      <w:bookmarkEnd w:id="8"/>
+      <w:bookmarkStart w:id="10" w:name="_Toc229867177"/>
+      <w:bookmarkStart w:id="11" w:name="introduction"/>
+      <w:bookmarkEnd w:id="9"/>
       <w:r>
         <w:rPr>
           <w:rFonts w:ascii="Times New Roman" w:hAnsi="Times New Roman" w:cs="Times New Roman"/>
@@ -4930,7 +4930,7 @@
         </w:rPr>
         <w:t>INTRODUCTION</w:t>
       </w:r>
-      <w:bookmarkEnd w:id="11"/>
+      <w:bookmarkEnd w:id="10"/>
     </w:p>
     <w:p>
       <w:pPr>
@@ -4940,8 +4940,8 @@
           <w:color w:val="auto"/>
         </w:rPr>
       </w:pPr>
-      <w:bookmarkStart w:id="12" w:name="background-and-motivation"/>
-      <w:bookmarkStart w:id="13" w:name="_Toc229867178"/>
+      <w:bookmarkStart w:id="12" w:name="_Toc229867178"/>
+      <w:bookmarkStart w:id="13" w:name="background-and-motivation"/>
       <w:r>
         <w:rPr>
           <w:rFonts w:ascii="Times New Roman" w:hAnsi="Times New Roman" w:cs="Times New Roman"/>
@@ -4949,7 +4949,7 @@
         </w:rPr>
         <w:t>Background and motivation</w:t>
       </w:r>
-      <w:bookmarkEnd w:id="13"/>
+      <w:bookmarkEnd w:id="12"/>
     </w:p>
     <w:p>
       <w:pPr>
@@ -5123,16 +5123,16 @@
           <w:rFonts w:ascii="Times New Roman" w:hAnsi="Times New Roman" w:cs="Times New Roman"/>
         </w:rPr>
       </w:pPr>
-      <w:bookmarkStart w:id="14" w:name="research-problem"/>
-      <w:bookmarkStart w:id="15" w:name="_Toc229867179"/>
-      <w:bookmarkEnd w:id="12"/>
+      <w:bookmarkStart w:id="14" w:name="_Toc229867179"/>
+      <w:bookmarkStart w:id="15" w:name="research-problem"/>
+      <w:bookmarkEnd w:id="13"/>
       <w:r>
         <w:rPr>
           <w:rFonts w:ascii="Times New Roman" w:hAnsi="Times New Roman" w:cs="Times New Roman"/>
         </w:rPr>
         <w:t>Research problem</w:t>
       </w:r>
-      <w:bookmarkEnd w:id="15"/>
+      <w:bookmarkEnd w:id="14"/>
     </w:p>
     <w:p>
       <w:pPr>
@@ -5222,9 +5222,9 @@
           <w:rFonts w:ascii="Times New Roman" w:hAnsi="Times New Roman" w:cs="Times New Roman"/>
         </w:rPr>
       </w:pPr>
-      <w:bookmarkStart w:id="16" w:name="research-questions"/>
-      <w:bookmarkStart w:id="17" w:name="_Toc229867180"/>
-      <w:bookmarkEnd w:id="14"/>
+      <w:bookmarkStart w:id="16" w:name="_Toc229867180"/>
+      <w:bookmarkStart w:id="17" w:name="research-questions"/>
+      <w:bookmarkEnd w:id="15"/>
       <w:r>
         <w:rPr>
           <w:rFonts w:ascii="Times New Roman" w:hAnsi="Times New Roman" w:cs="Times New Roman"/>
@@ -5232,7 +5232,7 @@
         <w:lastRenderedPageBreak/>
         <w:t>Research questions</w:t>
       </w:r>
-      <w:bookmarkEnd w:id="17"/>
+      <w:bookmarkEnd w:id="16"/>
     </w:p>
     <w:p>
       <w:pPr>
@@ -5245,21 +5245,19 @@
         <w:rPr>
           <w:rFonts w:ascii="Times New Roman" w:hAnsi="Times New Roman" w:cs="Times New Roman"/>
         </w:rPr>
-        <w:t xml:space="preserve">The thesis is </w:t>
-      </w:r>
-      <w:proofErr w:type="spellStart"/>
-      <w:r>
-        <w:rPr>
-          <w:rFonts w:ascii="Times New Roman" w:hAnsi="Times New Roman" w:cs="Times New Roman"/>
-        </w:rPr>
-        <w:t>organised</w:t>
-      </w:r>
-      <w:proofErr w:type="spellEnd"/>
-      <w:r>
-        <w:rPr>
-          <w:rFonts w:ascii="Times New Roman" w:hAnsi="Times New Roman" w:cs="Times New Roman"/>
-        </w:rPr>
-        <w:t xml:space="preserve"> around four questions:</w:t>
+        <w:t>The thesis is organi</w:t>
+      </w:r>
+      <w:r>
+        <w:rPr>
+          <w:rFonts w:ascii="Times New Roman" w:hAnsi="Times New Roman" w:cs="Times New Roman"/>
+        </w:rPr>
+        <w:t>z</w:t>
+      </w:r>
+      <w:r>
+        <w:rPr>
+          <w:rFonts w:ascii="Times New Roman" w:hAnsi="Times New Roman" w:cs="Times New Roman"/>
+        </w:rPr>
+        <w:t>ed around four questions:</w:t>
       </w:r>
     </w:p>
     <w:p>
@@ -5388,16 +5386,16 @@
           <w:rFonts w:ascii="Times New Roman" w:hAnsi="Times New Roman" w:cs="Times New Roman"/>
         </w:rPr>
       </w:pPr>
-      <w:bookmarkStart w:id="18" w:name="aim-and-objectives"/>
-      <w:bookmarkStart w:id="19" w:name="_Toc229867181"/>
-      <w:bookmarkEnd w:id="16"/>
+      <w:bookmarkStart w:id="18" w:name="_Toc229867181"/>
+      <w:bookmarkStart w:id="19" w:name="aim-and-objectives"/>
+      <w:bookmarkEnd w:id="17"/>
       <w:r>
         <w:rPr>
           <w:rFonts w:ascii="Times New Roman" w:hAnsi="Times New Roman" w:cs="Times New Roman"/>
         </w:rPr>
         <w:t>Aim and objectives</w:t>
       </w:r>
-      <w:bookmarkEnd w:id="19"/>
+      <w:bookmarkEnd w:id="18"/>
     </w:p>
     <w:p>
       <w:pPr>
@@ -5531,16 +5529,16 @@
           <w:rFonts w:ascii="Times New Roman" w:hAnsi="Times New Roman" w:cs="Times New Roman"/>
         </w:rPr>
       </w:pPr>
-      <w:bookmarkStart w:id="20" w:name="scientific-novelty"/>
-      <w:bookmarkStart w:id="21" w:name="_Toc229867182"/>
-      <w:bookmarkEnd w:id="18"/>
+      <w:bookmarkStart w:id="20" w:name="_Toc229867182"/>
+      <w:bookmarkStart w:id="21" w:name="scientific-novelty"/>
+      <w:bookmarkEnd w:id="19"/>
       <w:r>
         <w:rPr>
           <w:rFonts w:ascii="Times New Roman" w:hAnsi="Times New Roman" w:cs="Times New Roman"/>
         </w:rPr>
         <w:t>Scientific novelty</w:t>
       </w:r>
-      <w:bookmarkEnd w:id="21"/>
+      <w:bookmarkEnd w:id="20"/>
     </w:p>
     <w:p>
       <w:pPr>
@@ -5664,16 +5662,64 @@
           <w:rFonts w:ascii="Times New Roman" w:hAnsi="Times New Roman" w:cs="Times New Roman"/>
         </w:rPr>
       </w:pPr>
-      <w:bookmarkStart w:id="22" w:name="significance"/>
-      <w:bookmarkStart w:id="23" w:name="_Toc229867183"/>
-      <w:bookmarkEnd w:id="20"/>
+      <w:bookmarkStart w:id="22" w:name="_Toc229867183"/>
+      <w:bookmarkStart w:id="23" w:name="significance"/>
+      <w:bookmarkEnd w:id="21"/>
       <w:r>
         <w:rPr>
           <w:rFonts w:ascii="Times New Roman" w:hAnsi="Times New Roman" w:cs="Times New Roman"/>
         </w:rPr>
         <w:t>Significance</w:t>
       </w:r>
+      <w:bookmarkEnd w:id="22"/>
+    </w:p>
+    <w:p>
+      <w:pPr>
+        <w:pStyle w:val="FirstParagraph"/>
+        <w:jc w:val="both"/>
+        <w:rPr>
+          <w:rFonts w:ascii="Times New Roman" w:hAnsi="Times New Roman" w:cs="Times New Roman"/>
+        </w:rPr>
+      </w:pPr>
+      <w:r>
+        <w:rPr>
+          <w:rFonts w:ascii="Times New Roman" w:hAnsi="Times New Roman" w:cs="Times New Roman"/>
+        </w:rPr>
+        <w:t xml:space="preserve">For the engineering side, the thesis provides a reproducible pipeline (227-feature </w:t>
+      </w:r>
+      <w:proofErr w:type="spellStart"/>
+      <w:r>
+        <w:rPr>
+          <w:rFonts w:ascii="Times New Roman" w:hAnsi="Times New Roman" w:cs="Times New Roman"/>
+        </w:rPr>
+        <w:t>XGBoost</w:t>
+      </w:r>
+      <w:proofErr w:type="spellEnd"/>
+      <w:r>
+        <w:rPr>
+          <w:rFonts w:ascii="Times New Roman" w:hAnsi="Times New Roman" w:cs="Times New Roman"/>
+        </w:rPr>
+        <w:t>, dilated TCN, 205 k-parameter Transformer) calibrated to a public benchmark, with all hyperparameters and training seeds disclosed. For the clinical side, it offers a per-patient explanation tool whose output lives in a coordinate system clinicians already inhabit — hours since admission × physiological variable — rather than a coordinate system imposed by the model.</w:t>
+      </w:r>
+    </w:p>
+    <w:p>
+      <w:pPr>
+        <w:pStyle w:val="Heading2"/>
+        <w:jc w:val="both"/>
+        <w:rPr>
+          <w:rFonts w:ascii="Times New Roman" w:hAnsi="Times New Roman" w:cs="Times New Roman"/>
+        </w:rPr>
+      </w:pPr>
+      <w:bookmarkStart w:id="24" w:name="_Toc229867184"/>
+      <w:bookmarkStart w:id="25" w:name="structure-of-the-thesis"/>
       <w:bookmarkEnd w:id="23"/>
+      <w:r>
+        <w:rPr>
+          <w:rFonts w:ascii="Times New Roman" w:hAnsi="Times New Roman" w:cs="Times New Roman"/>
+        </w:rPr>
+        <w:t>Structure of the thesis</w:t>
+      </w:r>
+      <w:bookmarkEnd w:id="24"/>
     </w:p>
     <w:p>
       <w:pPr>
@@ -5687,21 +5733,84 @@
         <w:rPr>
           <w:rFonts w:ascii="Times New Roman" w:hAnsi="Times New Roman" w:cs="Times New Roman"/>
         </w:rPr>
-        <w:t xml:space="preserve">For the engineering side, the thesis provides a reproducible pipeline (227-feature </w:t>
-      </w:r>
-      <w:proofErr w:type="spellStart"/>
-      <w:r>
-        <w:rPr>
-          <w:rFonts w:ascii="Times New Roman" w:hAnsi="Times New Roman" w:cs="Times New Roman"/>
-        </w:rPr>
-        <w:t>XGBoost</w:t>
-      </w:r>
-      <w:proofErr w:type="spellEnd"/>
-      <w:r>
-        <w:rPr>
-          <w:rFonts w:ascii="Times New Roman" w:hAnsi="Times New Roman" w:cs="Times New Roman"/>
-        </w:rPr>
-        <w:t>, dilated TCN, 205 k-parameter Transformer) calibrated to a public benchmark, with all hyperparameters and training seeds disclosed. For the clinical side, it offers a per-patient explanation tool whose output lives in a coordinate system clinicians already inhabit — hours since admission × physiological variable — rather than a coordinate system imposed by the model.</w:t>
+        <w:t xml:space="preserve">The remainder of the thesis is </w:t>
+      </w:r>
+      <w:proofErr w:type="spellStart"/>
+      <w:r>
+        <w:rPr>
+          <w:rFonts w:ascii="Times New Roman" w:hAnsi="Times New Roman" w:cs="Times New Roman"/>
+        </w:rPr>
+        <w:t>organised</w:t>
+      </w:r>
+      <w:proofErr w:type="spellEnd"/>
+      <w:r>
+        <w:rPr>
+          <w:rFonts w:ascii="Times New Roman" w:hAnsi="Times New Roman" w:cs="Times New Roman"/>
+        </w:rPr>
+        <w:t xml:space="preserve"> as follows. Chapter 1 surveys the literature on severity scoring, deep learning for ICU prediction, and explainable artificial intelligence. Chapter 2 details the dataset, pre-processing, model architectures, the time-step SHAP procedure, and the clinical validation protocol. Chapter 3 presents the comparative results, the ablation analysis, the attribution case studies, and discusses what the experiments do and do not show. The Conclusion </w:t>
+      </w:r>
+      <w:proofErr w:type="spellStart"/>
+      <w:r>
+        <w:rPr>
+          <w:rFonts w:ascii="Times New Roman" w:hAnsi="Times New Roman" w:cs="Times New Roman"/>
+        </w:rPr>
+        <w:t>summarises</w:t>
+      </w:r>
+      <w:proofErr w:type="spellEnd"/>
+      <w:r>
+        <w:rPr>
+          <w:rFonts w:ascii="Times New Roman" w:hAnsi="Times New Roman" w:cs="Times New Roman"/>
+        </w:rPr>
+        <w:t xml:space="preserve"> the contributions and points to extensions on MIMIC-IV. Appendices contain the variable list, the full ablation table, and the figure pack at publication resolution.</w:t>
+      </w:r>
+    </w:p>
+    <w:p>
+      <w:pPr>
+        <w:pStyle w:val="Heading1"/>
+        <w:jc w:val="both"/>
+        <w:rPr>
+          <w:rFonts w:ascii="Times New Roman" w:hAnsi="Times New Roman" w:cs="Times New Roman"/>
+        </w:rPr>
+      </w:pPr>
+      <w:bookmarkStart w:id="26" w:name="_Toc229867185"/>
+      <w:bookmarkStart w:id="27" w:name="chapter-1.-literature-review"/>
+      <w:bookmarkEnd w:id="11"/>
+      <w:bookmarkEnd w:id="25"/>
+      <w:r>
+        <w:rPr>
+          <w:rFonts w:ascii="Times New Roman" w:hAnsi="Times New Roman" w:cs="Times New Roman"/>
+        </w:rPr>
+        <w:t>CHAPTER 1. LITERATURE REVIEW</w:t>
+      </w:r>
+      <w:bookmarkEnd w:id="26"/>
+    </w:p>
+    <w:p>
+      <w:pPr>
+        <w:pStyle w:val="FirstParagraph"/>
+        <w:jc w:val="both"/>
+        <w:rPr>
+          <w:rFonts w:ascii="Times New Roman" w:hAnsi="Times New Roman" w:cs="Times New Roman"/>
+        </w:rPr>
+      </w:pPr>
+      <w:r>
+        <w:rPr>
+          <w:rFonts w:ascii="Times New Roman" w:hAnsi="Times New Roman" w:cs="Times New Roman"/>
+        </w:rPr>
+        <w:t xml:space="preserve">This chapter situates the thesis at the intersection of three established research traditions: classical severity scoring in critical care medicine, machine learning approaches to clinical time series, and the still-maturing field of explainable artificial intelligence (XAI). The aim is not </w:t>
+      </w:r>
+      <w:proofErr w:type="spellStart"/>
+      <w:r>
+        <w:rPr>
+          <w:rFonts w:ascii="Times New Roman" w:hAnsi="Times New Roman" w:cs="Times New Roman"/>
+        </w:rPr>
+        <w:t>encyclopaedic</w:t>
+      </w:r>
+      <w:proofErr w:type="spellEnd"/>
+      <w:r>
+        <w:rPr>
+          <w:rFonts w:ascii="Times New Roman" w:hAnsi="Times New Roman" w:cs="Times New Roman"/>
+        </w:rPr>
+        <w:t xml:space="preserve"> coverage but enough orientation for a reader who is comfortable with one of these traditions to understand the contributions of the other two and to see why their combination is non-trivial.</w:t>
       </w:r>
     </w:p>
     <w:p>
@@ -5712,126 +5821,15 @@
           <w:rFonts w:ascii="Times New Roman" w:hAnsi="Times New Roman" w:cs="Times New Roman"/>
         </w:rPr>
       </w:pPr>
-      <w:bookmarkStart w:id="24" w:name="structure-of-the-thesis"/>
-      <w:bookmarkStart w:id="25" w:name="_Toc229867184"/>
-      <w:bookmarkEnd w:id="22"/>
-      <w:r>
-        <w:rPr>
-          <w:rFonts w:ascii="Times New Roman" w:hAnsi="Times New Roman" w:cs="Times New Roman"/>
-        </w:rPr>
-        <w:t>Structure of the thesis</w:t>
-      </w:r>
-      <w:bookmarkEnd w:id="25"/>
-    </w:p>
-    <w:p>
-      <w:pPr>
-        <w:pStyle w:val="FirstParagraph"/>
-        <w:jc w:val="both"/>
-        <w:rPr>
-          <w:rFonts w:ascii="Times New Roman" w:hAnsi="Times New Roman" w:cs="Times New Roman"/>
-        </w:rPr>
-      </w:pPr>
-      <w:r>
-        <w:rPr>
-          <w:rFonts w:ascii="Times New Roman" w:hAnsi="Times New Roman" w:cs="Times New Roman"/>
-        </w:rPr>
-        <w:t xml:space="preserve">The remainder of the thesis is </w:t>
-      </w:r>
-      <w:proofErr w:type="spellStart"/>
-      <w:r>
-        <w:rPr>
-          <w:rFonts w:ascii="Times New Roman" w:hAnsi="Times New Roman" w:cs="Times New Roman"/>
-        </w:rPr>
-        <w:t>organised</w:t>
-      </w:r>
-      <w:proofErr w:type="spellEnd"/>
-      <w:r>
-        <w:rPr>
-          <w:rFonts w:ascii="Times New Roman" w:hAnsi="Times New Roman" w:cs="Times New Roman"/>
-        </w:rPr>
-        <w:t xml:space="preserve"> as follows. Chapter 1 surveys the literature on severity scoring, deep learning for ICU prediction, and explainable artificial intelligence. Chapter 2 details the dataset, pre-processing, model architectures, the time-step SHAP procedure, and the clinical validation protocol. Chapter 3 presents the comparative results, the ablation analysis, the attribution case studies, and discusses what the experiments do and do not show. The Conclusion </w:t>
-      </w:r>
-      <w:proofErr w:type="spellStart"/>
-      <w:r>
-        <w:rPr>
-          <w:rFonts w:ascii="Times New Roman" w:hAnsi="Times New Roman" w:cs="Times New Roman"/>
-        </w:rPr>
-        <w:t>summarises</w:t>
-      </w:r>
-      <w:proofErr w:type="spellEnd"/>
-      <w:r>
-        <w:rPr>
-          <w:rFonts w:ascii="Times New Roman" w:hAnsi="Times New Roman" w:cs="Times New Roman"/>
-        </w:rPr>
-        <w:t xml:space="preserve"> the contributions and points to extensions on MIMIC-IV. Appendices contain the variable list, the full ablation table, and the figure pack at publication resolution.</w:t>
-      </w:r>
-    </w:p>
-    <w:p>
-      <w:pPr>
-        <w:pStyle w:val="Heading1"/>
-        <w:jc w:val="both"/>
-        <w:rPr>
-          <w:rFonts w:ascii="Times New Roman" w:hAnsi="Times New Roman" w:cs="Times New Roman"/>
-        </w:rPr>
-      </w:pPr>
-      <w:bookmarkStart w:id="26" w:name="chapter-1.-literature-review"/>
-      <w:bookmarkStart w:id="27" w:name="_Toc229867185"/>
-      <w:bookmarkEnd w:id="10"/>
-      <w:bookmarkEnd w:id="24"/>
-      <w:r>
-        <w:rPr>
-          <w:rFonts w:ascii="Times New Roman" w:hAnsi="Times New Roman" w:cs="Times New Roman"/>
-        </w:rPr>
-        <w:t>CHAPTER 1. LITERATURE REVIEW</w:t>
-      </w:r>
-      <w:bookmarkEnd w:id="27"/>
-    </w:p>
-    <w:p>
-      <w:pPr>
-        <w:pStyle w:val="FirstParagraph"/>
-        <w:jc w:val="both"/>
-        <w:rPr>
-          <w:rFonts w:ascii="Times New Roman" w:hAnsi="Times New Roman" w:cs="Times New Roman"/>
-        </w:rPr>
-      </w:pPr>
-      <w:r>
-        <w:rPr>
-          <w:rFonts w:ascii="Times New Roman" w:hAnsi="Times New Roman" w:cs="Times New Roman"/>
-        </w:rPr>
-        <w:t xml:space="preserve">This chapter situates the thesis at the intersection of three established research traditions: classical severity scoring in critical care medicine, machine learning approaches to clinical time series, and the still-maturing field of explainable artificial intelligence (XAI). The aim is not </w:t>
-      </w:r>
-      <w:proofErr w:type="spellStart"/>
-      <w:r>
-        <w:rPr>
-          <w:rFonts w:ascii="Times New Roman" w:hAnsi="Times New Roman" w:cs="Times New Roman"/>
-        </w:rPr>
-        <w:t>encyclopaedic</w:t>
-      </w:r>
-      <w:proofErr w:type="spellEnd"/>
-      <w:r>
-        <w:rPr>
-          <w:rFonts w:ascii="Times New Roman" w:hAnsi="Times New Roman" w:cs="Times New Roman"/>
-        </w:rPr>
-        <w:t xml:space="preserve"> coverage but enough orientation for a reader who is comfortable with one of these traditions to understand the contributions of the other two and to see why their combination is non-trivial.</w:t>
-      </w:r>
-    </w:p>
-    <w:p>
-      <w:pPr>
-        <w:pStyle w:val="Heading2"/>
-        <w:jc w:val="both"/>
-        <w:rPr>
-          <w:rFonts w:ascii="Times New Roman" w:hAnsi="Times New Roman" w:cs="Times New Roman"/>
-        </w:rPr>
-      </w:pPr>
-      <w:bookmarkStart w:id="28" w:name="X0dde3737ec40180263f626abfb996effd2d66f1"/>
-      <w:bookmarkStart w:id="29" w:name="_Toc229867186"/>
+      <w:bookmarkStart w:id="28" w:name="_Toc229867186"/>
+      <w:bookmarkStart w:id="29" w:name="X0dde3737ec40180263f626abfb996effd2d66f1"/>
       <w:r>
         <w:rPr>
           <w:rFonts w:ascii="Times New Roman" w:hAnsi="Times New Roman" w:cs="Times New Roman"/>
         </w:rPr>
         <w:t>1.1 Mortality prediction in the intensive care unit</w:t>
       </w:r>
-      <w:bookmarkEnd w:id="29"/>
+      <w:bookmarkEnd w:id="28"/>
     </w:p>
     <w:p>
       <w:pPr>
@@ -6154,9 +6152,9 @@
           <w:rFonts w:ascii="Times New Roman" w:hAnsi="Times New Roman" w:cs="Times New Roman"/>
         </w:rPr>
       </w:pPr>
-      <w:bookmarkStart w:id="35" w:name="machine-learning-on-icu-time-series"/>
-      <w:bookmarkStart w:id="36" w:name="_Toc229867187"/>
-      <w:bookmarkEnd w:id="28"/>
+      <w:bookmarkStart w:id="35" w:name="_Toc229867187"/>
+      <w:bookmarkStart w:id="36" w:name="machine-learning-on-icu-time-series"/>
+      <w:bookmarkEnd w:id="29"/>
       <w:bookmarkEnd w:id="34"/>
       <w:r>
         <w:rPr>
@@ -6164,7 +6162,7 @@
         </w:rPr>
         <w:t>1.2 Machine learning on ICU time series</w:t>
       </w:r>
-      <w:bookmarkEnd w:id="36"/>
+      <w:bookmarkEnd w:id="35"/>
     </w:p>
     <w:p>
       <w:pPr>
@@ -6593,9 +6591,9 @@
           <w:rFonts w:ascii="Times New Roman" w:hAnsi="Times New Roman" w:cs="Times New Roman"/>
         </w:rPr>
       </w:pPr>
-      <w:bookmarkStart w:id="42" w:name="explainable-artificial-intelligence"/>
-      <w:bookmarkStart w:id="43" w:name="_Toc229867188"/>
-      <w:bookmarkEnd w:id="35"/>
+      <w:bookmarkStart w:id="42" w:name="_Toc229867188"/>
+      <w:bookmarkStart w:id="43" w:name="explainable-artificial-intelligence"/>
+      <w:bookmarkEnd w:id="36"/>
       <w:bookmarkEnd w:id="41"/>
       <w:r>
         <w:rPr>
@@ -6603,7 +6601,7 @@
         </w:rPr>
         <w:t>1.3 Explainable artificial intelligence</w:t>
       </w:r>
-      <w:bookmarkEnd w:id="43"/>
+      <w:bookmarkEnd w:id="42"/>
     </w:p>
     <w:p>
       <w:pPr>
@@ -7277,9 +7275,9 @@
           <w:rFonts w:ascii="Times New Roman" w:hAnsi="Times New Roman" w:cs="Times New Roman"/>
         </w:rPr>
       </w:pPr>
-      <w:bookmarkStart w:id="50" w:name="synthesis-and-position-of-this-work"/>
-      <w:bookmarkStart w:id="51" w:name="_Toc229867189"/>
-      <w:bookmarkEnd w:id="42"/>
+      <w:bookmarkStart w:id="50" w:name="_Toc229867189"/>
+      <w:bookmarkStart w:id="51" w:name="synthesis-and-position-of-this-work"/>
+      <w:bookmarkEnd w:id="43"/>
       <w:bookmarkEnd w:id="49"/>
       <w:r>
         <w:rPr>
@@ -7287,7 +7285,7 @@
         </w:rPr>
         <w:t>1.4 Synthesis and position of this work</w:t>
       </w:r>
-      <w:bookmarkEnd w:id="51"/>
+      <w:bookmarkEnd w:id="50"/>
     </w:p>
     <w:p>
       <w:pPr>
@@ -7473,10 +7471,10 @@
           <w:rFonts w:ascii="Times New Roman" w:hAnsi="Times New Roman" w:cs="Times New Roman"/>
         </w:rPr>
       </w:pPr>
-      <w:bookmarkStart w:id="52" w:name="chapter-2.-methodology-and-data"/>
-      <w:bookmarkStart w:id="53" w:name="_Toc229867190"/>
-      <w:bookmarkEnd w:id="26"/>
-      <w:bookmarkEnd w:id="50"/>
+      <w:bookmarkStart w:id="52" w:name="_Toc229867190"/>
+      <w:bookmarkStart w:id="53" w:name="chapter-2.-methodology-and-data"/>
+      <w:bookmarkEnd w:id="27"/>
+      <w:bookmarkEnd w:id="51"/>
       <w:r>
         <w:rPr>
           <w:rFonts w:ascii="Times New Roman" w:hAnsi="Times New Roman" w:cs="Times New Roman"/>
@@ -7484,7 +7482,7 @@
         <w:lastRenderedPageBreak/>
         <w:t>CHAPTER 2. METHODOLOGY AND DATA</w:t>
       </w:r>
-      <w:bookmarkEnd w:id="53"/>
+      <w:bookmarkEnd w:id="52"/>
     </w:p>
     <w:p>
       <w:pPr>
@@ -7509,120 +7507,120 @@
           <w:rFonts w:ascii="Times New Roman" w:hAnsi="Times New Roman" w:cs="Times New Roman"/>
         </w:rPr>
       </w:pPr>
-      <w:bookmarkStart w:id="54" w:name="dataset"/>
-      <w:bookmarkStart w:id="55" w:name="_Toc229867191"/>
+      <w:bookmarkStart w:id="54" w:name="_Toc229867191"/>
+      <w:bookmarkStart w:id="55" w:name="dataset"/>
       <w:r>
         <w:rPr>
           <w:rFonts w:ascii="Times New Roman" w:hAnsi="Times New Roman" w:cs="Times New Roman"/>
         </w:rPr>
         <w:t>2.1 Dataset</w:t>
       </w:r>
+      <w:bookmarkEnd w:id="54"/>
+    </w:p>
+    <w:p>
+      <w:pPr>
+        <w:pStyle w:val="FirstParagraph"/>
+        <w:jc w:val="both"/>
+        <w:rPr>
+          <w:rFonts w:ascii="Times New Roman" w:hAnsi="Times New Roman" w:cs="Times New Roman"/>
+        </w:rPr>
+      </w:pPr>
+      <w:r>
+        <w:rPr>
+          <w:rFonts w:ascii="Times New Roman" w:hAnsi="Times New Roman" w:cs="Times New Roman"/>
+        </w:rPr>
+        <w:t>The PhysioNet/Computing in Cardiology Challenge 2012 [Silva et al., 2012] released three sets of 4000 adult ICU records each. Set-A is the only publicly labelled subset and is the focus of this work. Each record contains time-stamped physiological and laboratory observations from the first 48 hours after ICU admission together with a six-element general descriptor vector (age, gender, height, ICU type, weight, time of admission). The outcome label is in-hospital mortality, a binary variable indicating whether the patient died before discharge. The overall mortality rate after cleaning is 13.5 per cent — 554 deaths in 4000 admissions — which makes the prediction problem strongly imbalanced.</w:t>
+      </w:r>
+    </w:p>
+    <w:p>
+      <w:pPr>
+        <w:pStyle w:val="BodyText"/>
+        <w:jc w:val="both"/>
+        <w:rPr>
+          <w:rFonts w:ascii="Times New Roman" w:hAnsi="Times New Roman" w:cs="Times New Roman"/>
+        </w:rPr>
+      </w:pPr>
+      <w:r>
+        <w:rPr>
+          <w:rFonts w:ascii="Times New Roman" w:hAnsi="Times New Roman" w:cs="Times New Roman"/>
+        </w:rPr>
+        <w:t xml:space="preserve">The thirty-seven physiological variables retained in this work span the full range of bedside and laboratory measurements relevant to early-ICU triage: vital signs (heart rate, mean arterial pressure, systolic and diastolic blood pressure, respiratory rate, oxygen saturation, temperature), blood gas analyses (pH, </w:t>
+      </w:r>
+      <w:proofErr w:type="spellStart"/>
+      <w:r>
+        <w:rPr>
+          <w:rFonts w:ascii="Times New Roman" w:hAnsi="Times New Roman" w:cs="Times New Roman"/>
+        </w:rPr>
+        <w:t>PaCO</w:t>
+      </w:r>
+      <w:proofErr w:type="spellEnd"/>
+      <w:r>
+        <w:rPr>
+          <w:rFonts w:ascii="Times New Roman" w:hAnsi="Times New Roman" w:cs="Times New Roman"/>
+        </w:rPr>
+        <w:t xml:space="preserve">₂, </w:t>
+      </w:r>
+      <w:proofErr w:type="spellStart"/>
+      <w:r>
+        <w:rPr>
+          <w:rFonts w:ascii="Times New Roman" w:hAnsi="Times New Roman" w:cs="Times New Roman"/>
+        </w:rPr>
+        <w:t>PaO</w:t>
+      </w:r>
+      <w:proofErr w:type="spellEnd"/>
+      <w:r>
+        <w:rPr>
+          <w:rFonts w:ascii="Times New Roman" w:hAnsi="Times New Roman" w:cs="Times New Roman"/>
+        </w:rPr>
+        <w:t xml:space="preserve">₂, base excess, fraction of inspired oxygen), </w:t>
+      </w:r>
+      <w:proofErr w:type="spellStart"/>
+      <w:r>
+        <w:rPr>
+          <w:rFonts w:ascii="Times New Roman" w:hAnsi="Times New Roman" w:cs="Times New Roman"/>
+        </w:rPr>
+        <w:t>haematology</w:t>
+      </w:r>
+      <w:proofErr w:type="spellEnd"/>
+      <w:r>
+        <w:rPr>
+          <w:rFonts w:ascii="Times New Roman" w:hAnsi="Times New Roman" w:cs="Times New Roman"/>
+        </w:rPr>
+        <w:t xml:space="preserve"> (</w:t>
+      </w:r>
+      <w:proofErr w:type="spellStart"/>
+      <w:r>
+        <w:rPr>
+          <w:rFonts w:ascii="Times New Roman" w:hAnsi="Times New Roman" w:cs="Times New Roman"/>
+        </w:rPr>
+        <w:t>haematocrit</w:t>
+      </w:r>
+      <w:proofErr w:type="spellEnd"/>
+      <w:r>
+        <w:rPr>
+          <w:rFonts w:ascii="Times New Roman" w:hAnsi="Times New Roman" w:cs="Times New Roman"/>
+        </w:rPr>
+        <w:t>, white-cell count, platelets), chemistry (sodium, potassium, chloride, bicarbonate, blood urea nitrogen, creatinine, glucose, albumin, total bilirubin, alkaline phosphatase, ALT, AST, magnesium, lactate, troponin-I, troponin-T), urine output, the Glasgow Coma Scale, and the mechanical ventilation indicator. The full list with units and reference ranges is in Appendix A.</w:t>
+      </w:r>
+    </w:p>
+    <w:p>
+      <w:pPr>
+        <w:pStyle w:val="Heading2"/>
+        <w:jc w:val="both"/>
+        <w:rPr>
+          <w:rFonts w:ascii="Times New Roman" w:hAnsi="Times New Roman" w:cs="Times New Roman"/>
+        </w:rPr>
+      </w:pPr>
+      <w:bookmarkStart w:id="56" w:name="_Toc229867192"/>
+      <w:bookmarkStart w:id="57" w:name="pre-processing"/>
       <w:bookmarkEnd w:id="55"/>
-    </w:p>
-    <w:p>
-      <w:pPr>
-        <w:pStyle w:val="FirstParagraph"/>
-        <w:jc w:val="both"/>
-        <w:rPr>
-          <w:rFonts w:ascii="Times New Roman" w:hAnsi="Times New Roman" w:cs="Times New Roman"/>
-        </w:rPr>
-      </w:pPr>
-      <w:r>
-        <w:rPr>
-          <w:rFonts w:ascii="Times New Roman" w:hAnsi="Times New Roman" w:cs="Times New Roman"/>
-        </w:rPr>
-        <w:t>The PhysioNet/Computing in Cardiology Challenge 2012 [Silva et al., 2012] released three sets of 4000 adult ICU records each. Set-A is the only publicly labelled subset and is the focus of this work. Each record contains time-stamped physiological and laboratory observations from the first 48 hours after ICU admission together with a six-element general descriptor vector (age, gender, height, ICU type, weight, time of admission). The outcome label is in-hospital mortality, a binary variable indicating whether the patient died before discharge. The overall mortality rate after cleaning is 13.5 per cent — 554 deaths in 4000 admissions — which makes the prediction problem strongly imbalanced.</w:t>
-      </w:r>
-    </w:p>
-    <w:p>
-      <w:pPr>
-        <w:pStyle w:val="BodyText"/>
-        <w:jc w:val="both"/>
-        <w:rPr>
-          <w:rFonts w:ascii="Times New Roman" w:hAnsi="Times New Roman" w:cs="Times New Roman"/>
-        </w:rPr>
-      </w:pPr>
-      <w:r>
-        <w:rPr>
-          <w:rFonts w:ascii="Times New Roman" w:hAnsi="Times New Roman" w:cs="Times New Roman"/>
-        </w:rPr>
-        <w:t xml:space="preserve">The thirty-seven physiological variables retained in this work span the full range of bedside and laboratory measurements relevant to early-ICU triage: vital signs (heart rate, mean arterial pressure, systolic and diastolic blood pressure, respiratory rate, oxygen saturation, temperature), blood gas analyses (pH, </w:t>
-      </w:r>
-      <w:proofErr w:type="spellStart"/>
-      <w:r>
-        <w:rPr>
-          <w:rFonts w:ascii="Times New Roman" w:hAnsi="Times New Roman" w:cs="Times New Roman"/>
-        </w:rPr>
-        <w:t>PaCO</w:t>
-      </w:r>
-      <w:proofErr w:type="spellEnd"/>
-      <w:r>
-        <w:rPr>
-          <w:rFonts w:ascii="Times New Roman" w:hAnsi="Times New Roman" w:cs="Times New Roman"/>
-        </w:rPr>
-        <w:t xml:space="preserve">₂, </w:t>
-      </w:r>
-      <w:proofErr w:type="spellStart"/>
-      <w:r>
-        <w:rPr>
-          <w:rFonts w:ascii="Times New Roman" w:hAnsi="Times New Roman" w:cs="Times New Roman"/>
-        </w:rPr>
-        <w:t>PaO</w:t>
-      </w:r>
-      <w:proofErr w:type="spellEnd"/>
-      <w:r>
-        <w:rPr>
-          <w:rFonts w:ascii="Times New Roman" w:hAnsi="Times New Roman" w:cs="Times New Roman"/>
-        </w:rPr>
-        <w:t xml:space="preserve">₂, base excess, fraction of inspired oxygen), </w:t>
-      </w:r>
-      <w:proofErr w:type="spellStart"/>
-      <w:r>
-        <w:rPr>
-          <w:rFonts w:ascii="Times New Roman" w:hAnsi="Times New Roman" w:cs="Times New Roman"/>
-        </w:rPr>
-        <w:t>haematology</w:t>
-      </w:r>
-      <w:proofErr w:type="spellEnd"/>
-      <w:r>
-        <w:rPr>
-          <w:rFonts w:ascii="Times New Roman" w:hAnsi="Times New Roman" w:cs="Times New Roman"/>
-        </w:rPr>
-        <w:t xml:space="preserve"> (</w:t>
-      </w:r>
-      <w:proofErr w:type="spellStart"/>
-      <w:r>
-        <w:rPr>
-          <w:rFonts w:ascii="Times New Roman" w:hAnsi="Times New Roman" w:cs="Times New Roman"/>
-        </w:rPr>
-        <w:t>haematocrit</w:t>
-      </w:r>
-      <w:proofErr w:type="spellEnd"/>
-      <w:r>
-        <w:rPr>
-          <w:rFonts w:ascii="Times New Roman" w:hAnsi="Times New Roman" w:cs="Times New Roman"/>
-        </w:rPr>
-        <w:t>, white-cell count, platelets), chemistry (sodium, potassium, chloride, bicarbonate, blood urea nitrogen, creatinine, glucose, albumin, total bilirubin, alkaline phosphatase, ALT, AST, magnesium, lactate, troponin-I, troponin-T), urine output, the Glasgow Coma Scale, and the mechanical ventilation indicator. The full list with units and reference ranges is in Appendix A.</w:t>
-      </w:r>
-    </w:p>
-    <w:p>
-      <w:pPr>
-        <w:pStyle w:val="Heading2"/>
-        <w:jc w:val="both"/>
-        <w:rPr>
-          <w:rFonts w:ascii="Times New Roman" w:hAnsi="Times New Roman" w:cs="Times New Roman"/>
-        </w:rPr>
-      </w:pPr>
-      <w:bookmarkStart w:id="56" w:name="pre-processing"/>
-      <w:bookmarkStart w:id="57" w:name="_Toc229867192"/>
-      <w:bookmarkEnd w:id="54"/>
       <w:r>
         <w:rPr>
           <w:rFonts w:ascii="Times New Roman" w:hAnsi="Times New Roman" w:cs="Times New Roman"/>
         </w:rPr>
         <w:t>2.2 Pre-processing</w:t>
       </w:r>
-      <w:bookmarkEnd w:id="57"/>
+      <w:bookmarkEnd w:id="56"/>
     </w:p>
     <w:p>
       <w:pPr>
@@ -8235,9 +8233,9 @@
           <w:rFonts w:ascii="Times New Roman" w:hAnsi="Times New Roman" w:cs="Times New Roman"/>
         </w:rPr>
       </w:pPr>
-      <w:bookmarkStart w:id="63" w:name="X3ab7164050caa764b2f2dbde7d5fe0ea9ee5baf"/>
-      <w:bookmarkStart w:id="64" w:name="_Toc229867193"/>
-      <w:bookmarkEnd w:id="56"/>
+      <w:bookmarkStart w:id="63" w:name="_Toc229867193"/>
+      <w:bookmarkStart w:id="64" w:name="X3ab7164050caa764b2f2dbde7d5fe0ea9ee5baf"/>
+      <w:bookmarkEnd w:id="57"/>
       <w:bookmarkEnd w:id="62"/>
       <w:r>
         <w:rPr>
@@ -8259,7 +8257,7 @@
         </w:rPr>
         <w:t xml:space="preserve"> on engineered features</w:t>
       </w:r>
-      <w:bookmarkEnd w:id="64"/>
+      <w:bookmarkEnd w:id="63"/>
     </w:p>
     <w:p>
       <w:pPr>
@@ -8426,78 +8424,78 @@
           <w:rFonts w:ascii="Times New Roman" w:hAnsi="Times New Roman" w:cs="Times New Roman"/>
         </w:rPr>
       </w:pPr>
-      <w:bookmarkStart w:id="65" w:name="Xb6e54f4137d5cdee78344c2c649ab0a1f40421c"/>
-      <w:bookmarkStart w:id="66" w:name="_Toc229867194"/>
-      <w:bookmarkEnd w:id="63"/>
+      <w:bookmarkStart w:id="65" w:name="_Toc229867194"/>
+      <w:bookmarkStart w:id="66" w:name="Xb6e54f4137d5cdee78344c2c649ab0a1f40421c"/>
+      <w:bookmarkEnd w:id="64"/>
       <w:r>
         <w:rPr>
           <w:rFonts w:ascii="Times New Roman" w:hAnsi="Times New Roman" w:cs="Times New Roman"/>
         </w:rPr>
         <w:t>2.4 Model family II — Temporal Convolutional Network</w:t>
       </w:r>
+      <w:bookmarkEnd w:id="65"/>
+    </w:p>
+    <w:p>
+      <w:pPr>
+        <w:pStyle w:val="FirstParagraph"/>
+        <w:jc w:val="both"/>
+        <w:rPr>
+          <w:rFonts w:ascii="Times New Roman" w:hAnsi="Times New Roman" w:cs="Times New Roman"/>
+        </w:rPr>
+      </w:pPr>
+      <w:r>
+        <w:rPr>
+          <w:rFonts w:ascii="Times New Roman" w:hAnsi="Times New Roman" w:cs="Times New Roman"/>
+        </w:rPr>
+        <w:t xml:space="preserve">The TCN baseline follows the canonical residual block design of Bai, Kolter, and </w:t>
+      </w:r>
+      <w:proofErr w:type="spellStart"/>
+      <w:r>
+        <w:rPr>
+          <w:rFonts w:ascii="Times New Roman" w:hAnsi="Times New Roman" w:cs="Times New Roman"/>
+        </w:rPr>
+        <w:t>Koltun</w:t>
+      </w:r>
+      <w:proofErr w:type="spellEnd"/>
+      <w:r>
+        <w:rPr>
+          <w:rFonts w:ascii="Times New Roman" w:hAnsi="Times New Roman" w:cs="Times New Roman"/>
+        </w:rPr>
+        <w:t xml:space="preserve"> [Bai et al., 2018]. The input is the (48, 74) tensor (37 </w:t>
+      </w:r>
+      <w:proofErr w:type="spellStart"/>
+      <w:r>
+        <w:rPr>
+          <w:rFonts w:ascii="Times New Roman" w:hAnsi="Times New Roman" w:cs="Times New Roman"/>
+        </w:rPr>
+        <w:t>normalised</w:t>
+      </w:r>
+      <w:proofErr w:type="spellEnd"/>
+      <w:r>
+        <w:rPr>
+          <w:rFonts w:ascii="Times New Roman" w:hAnsi="Times New Roman" w:cs="Times New Roman"/>
+        </w:rPr>
+        <w:t xml:space="preserve"> values + 37 missingness flags) and the output is the scalar logit. Four dilated causal convolutional blocks with dilations {1, 2, 4, 8} are stacked, each with 64 filters, kernel size 3, and dropout 0.2. The receptive field at the output layer covers 31 hours of input, which is sufficient for the 48-hour window. Total parameter count is 58 753. Training uses Adam with learning rate 3 × 10⁻⁴, weight decay 5 × 10⁻⁴, batch size 64, gradient norm clipped at 1.0, focal loss with α = 0.861 and γ = 2.0 (see Section 2.5.3), early stopping on validation AUPRC with patience 25, maximum 100 epochs.</w:t>
+      </w:r>
+    </w:p>
+    <w:p>
+      <w:pPr>
+        <w:pStyle w:val="Heading2"/>
+        <w:jc w:val="both"/>
+        <w:rPr>
+          <w:rFonts w:ascii="Times New Roman" w:hAnsi="Times New Roman" w:cs="Times New Roman"/>
+        </w:rPr>
+      </w:pPr>
+      <w:bookmarkStart w:id="67" w:name="_Toc229867195"/>
+      <w:bookmarkStart w:id="68" w:name="model-family-iii-time-aware-transformer"/>
       <w:bookmarkEnd w:id="66"/>
-    </w:p>
-    <w:p>
-      <w:pPr>
-        <w:pStyle w:val="FirstParagraph"/>
-        <w:jc w:val="both"/>
-        <w:rPr>
-          <w:rFonts w:ascii="Times New Roman" w:hAnsi="Times New Roman" w:cs="Times New Roman"/>
-        </w:rPr>
-      </w:pPr>
-      <w:r>
-        <w:rPr>
-          <w:rFonts w:ascii="Times New Roman" w:hAnsi="Times New Roman" w:cs="Times New Roman"/>
-        </w:rPr>
-        <w:t xml:space="preserve">The TCN baseline follows the canonical residual block design of Bai, Kolter, and </w:t>
-      </w:r>
-      <w:proofErr w:type="spellStart"/>
-      <w:r>
-        <w:rPr>
-          <w:rFonts w:ascii="Times New Roman" w:hAnsi="Times New Roman" w:cs="Times New Roman"/>
-        </w:rPr>
-        <w:t>Koltun</w:t>
-      </w:r>
-      <w:proofErr w:type="spellEnd"/>
-      <w:r>
-        <w:rPr>
-          <w:rFonts w:ascii="Times New Roman" w:hAnsi="Times New Roman" w:cs="Times New Roman"/>
-        </w:rPr>
-        <w:t xml:space="preserve"> [Bai et al., 2018]. The input is the (48, 74) tensor (37 </w:t>
-      </w:r>
-      <w:proofErr w:type="spellStart"/>
-      <w:r>
-        <w:rPr>
-          <w:rFonts w:ascii="Times New Roman" w:hAnsi="Times New Roman" w:cs="Times New Roman"/>
-        </w:rPr>
-        <w:t>normalised</w:t>
-      </w:r>
-      <w:proofErr w:type="spellEnd"/>
-      <w:r>
-        <w:rPr>
-          <w:rFonts w:ascii="Times New Roman" w:hAnsi="Times New Roman" w:cs="Times New Roman"/>
-        </w:rPr>
-        <w:t xml:space="preserve"> values + 37 missingness flags) and the output is the scalar logit. Four dilated causal convolutional blocks with dilations {1, 2, 4, 8} are stacked, each with 64 filters, kernel size 3, and dropout 0.2. The receptive field at the output layer covers 31 hours of input, which is sufficient for the 48-hour window. Total parameter count is 58 753. Training uses Adam with learning rate 3 × 10⁻⁴, weight decay 5 × 10⁻⁴, batch size 64, gradient norm clipped at 1.0, focal loss with α = 0.861 and γ = 2.0 (see Section 2.5.3), early stopping on validation AUPRC with patience 25, maximum 100 epochs.</w:t>
-      </w:r>
-    </w:p>
-    <w:p>
-      <w:pPr>
-        <w:pStyle w:val="Heading2"/>
-        <w:jc w:val="both"/>
-        <w:rPr>
-          <w:rFonts w:ascii="Times New Roman" w:hAnsi="Times New Roman" w:cs="Times New Roman"/>
-        </w:rPr>
-      </w:pPr>
-      <w:bookmarkStart w:id="67" w:name="model-family-iii-time-aware-transformer"/>
-      <w:bookmarkStart w:id="68" w:name="_Toc229867195"/>
-      <w:bookmarkEnd w:id="65"/>
       <w:r>
         <w:rPr>
           <w:rFonts w:ascii="Times New Roman" w:hAnsi="Times New Roman" w:cs="Times New Roman"/>
         </w:rPr>
         <w:t>2.5 Model family III — Time-Aware Transformer</w:t>
       </w:r>
-      <w:bookmarkEnd w:id="68"/>
+      <w:bookmarkEnd w:id="67"/>
     </w:p>
     <w:p>
       <w:pPr>
@@ -9164,9 +9162,9 @@
           <w:rFonts w:ascii="Times New Roman" w:hAnsi="Times New Roman" w:cs="Times New Roman"/>
         </w:rPr>
       </w:pPr>
-      <w:bookmarkStart w:id="75" w:name="time-step-shap-attribution"/>
-      <w:bookmarkStart w:id="76" w:name="_Toc229867196"/>
-      <w:bookmarkEnd w:id="67"/>
+      <w:bookmarkStart w:id="75" w:name="_Toc229867196"/>
+      <w:bookmarkStart w:id="76" w:name="time-step-shap-attribution"/>
+      <w:bookmarkEnd w:id="68"/>
       <w:bookmarkEnd w:id="74"/>
       <w:r>
         <w:rPr>
@@ -9174,7 +9172,7 @@
         </w:rPr>
         <w:t>2.6 Time-step SHAP attribution</w:t>
       </w:r>
-      <w:bookmarkEnd w:id="76"/>
+      <w:bookmarkEnd w:id="75"/>
     </w:p>
     <w:p>
       <w:pPr>
@@ -10224,9 +10222,9 @@
           <w:rFonts w:ascii="Times New Roman" w:hAnsi="Times New Roman" w:cs="Times New Roman"/>
         </w:rPr>
       </w:pPr>
-      <w:bookmarkStart w:id="80" w:name="X1a642e93933519032980e6380e094233e035c4b"/>
-      <w:bookmarkStart w:id="81" w:name="_Toc229867197"/>
-      <w:bookmarkEnd w:id="75"/>
+      <w:bookmarkStart w:id="80" w:name="_Toc229867197"/>
+      <w:bookmarkStart w:id="81" w:name="X1a642e93933519032980e6380e094233e035c4b"/>
+      <w:bookmarkEnd w:id="76"/>
       <w:bookmarkEnd w:id="79"/>
       <w:r>
         <w:rPr>
@@ -10234,7 +10232,7 @@
         </w:rPr>
         <w:t>2.7 Clinical validation against SOFA and SAPS-I</w:t>
       </w:r>
-      <w:bookmarkEnd w:id="81"/>
+      <w:bookmarkEnd w:id="80"/>
     </w:p>
     <w:p>
       <w:pPr>
@@ -10570,9 +10568,9 @@
           <w:rFonts w:ascii="Times New Roman" w:hAnsi="Times New Roman" w:cs="Times New Roman"/>
         </w:rPr>
       </w:pPr>
-      <w:bookmarkStart w:id="85" w:name="ablation-study"/>
-      <w:bookmarkStart w:id="86" w:name="_Toc229867198"/>
-      <w:bookmarkEnd w:id="80"/>
+      <w:bookmarkStart w:id="85" w:name="_Toc229867198"/>
+      <w:bookmarkStart w:id="86" w:name="ablation-study"/>
+      <w:bookmarkEnd w:id="81"/>
       <w:bookmarkEnd w:id="84"/>
       <w:r>
         <w:rPr>
@@ -10580,7 +10578,7 @@
         </w:rPr>
         <w:t>2.8 Ablation study</w:t>
       </w:r>
-      <w:bookmarkEnd w:id="86"/>
+      <w:bookmarkEnd w:id="85"/>
     </w:p>
     <w:p>
       <w:pPr>
@@ -10736,16 +10734,16 @@
           <w:rFonts w:ascii="Times New Roman" w:hAnsi="Times New Roman" w:cs="Times New Roman"/>
         </w:rPr>
       </w:pPr>
-      <w:bookmarkStart w:id="87" w:name="evaluation-metrics"/>
-      <w:bookmarkStart w:id="88" w:name="_Toc229867199"/>
-      <w:bookmarkEnd w:id="85"/>
+      <w:bookmarkStart w:id="87" w:name="_Toc229867199"/>
+      <w:bookmarkStart w:id="88" w:name="evaluation-metrics"/>
+      <w:bookmarkEnd w:id="86"/>
       <w:r>
         <w:rPr>
           <w:rFonts w:ascii="Times New Roman" w:hAnsi="Times New Roman" w:cs="Times New Roman"/>
         </w:rPr>
         <w:t>2.9 Evaluation metrics</w:t>
       </w:r>
-      <w:bookmarkEnd w:id="88"/>
+      <w:bookmarkEnd w:id="87"/>
     </w:p>
     <w:p>
       <w:pPr>
@@ -10936,19 +10934,422 @@
           <w:rFonts w:ascii="Times New Roman" w:hAnsi="Times New Roman" w:cs="Times New Roman"/>
         </w:rPr>
       </w:pPr>
-      <w:bookmarkStart w:id="89" w:name="implementation-and-reproducibility"/>
-      <w:bookmarkStart w:id="90" w:name="_Toc229867200"/>
-      <w:bookmarkEnd w:id="87"/>
+      <w:bookmarkStart w:id="89" w:name="_Toc229867200"/>
+      <w:bookmarkStart w:id="90" w:name="implementation-and-reproducibility"/>
+      <w:bookmarkEnd w:id="88"/>
       <w:r>
         <w:rPr>
           <w:rFonts w:ascii="Times New Roman" w:hAnsi="Times New Roman" w:cs="Times New Roman"/>
         </w:rPr>
         <w:t>2.10 Implementation and reproducibility</w:t>
       </w:r>
+      <w:bookmarkEnd w:id="89"/>
+    </w:p>
+    <w:p>
+      <w:pPr>
+        <w:pStyle w:val="FirstParagraph"/>
+        <w:jc w:val="both"/>
+        <w:rPr>
+          <w:rFonts w:ascii="Times New Roman" w:hAnsi="Times New Roman" w:cs="Times New Roman"/>
+        </w:rPr>
+      </w:pPr>
+      <w:r>
+        <w:rPr>
+          <w:rFonts w:ascii="Times New Roman" w:hAnsi="Times New Roman" w:cs="Times New Roman"/>
+        </w:rPr>
+        <w:t xml:space="preserve">All experiments are implemented in Python 3.11 with </w:t>
+      </w:r>
+      <w:proofErr w:type="spellStart"/>
+      <w:r>
+        <w:rPr>
+          <w:rFonts w:ascii="Times New Roman" w:hAnsi="Times New Roman" w:cs="Times New Roman"/>
+        </w:rPr>
+        <w:t>PyTorch</w:t>
+      </w:r>
+      <w:proofErr w:type="spellEnd"/>
+      <w:r>
+        <w:rPr>
+          <w:rFonts w:ascii="Times New Roman" w:hAnsi="Times New Roman" w:cs="Times New Roman"/>
+        </w:rPr>
+        <w:t xml:space="preserve"> 2.1, </w:t>
+      </w:r>
+      <w:proofErr w:type="spellStart"/>
+      <w:r>
+        <w:rPr>
+          <w:rFonts w:ascii="Times New Roman" w:hAnsi="Times New Roman" w:cs="Times New Roman"/>
+        </w:rPr>
+        <w:t>XGBoost</w:t>
+      </w:r>
+      <w:proofErr w:type="spellEnd"/>
+      <w:r>
+        <w:rPr>
+          <w:rFonts w:ascii="Times New Roman" w:hAnsi="Times New Roman" w:cs="Times New Roman"/>
+        </w:rPr>
+        <w:t xml:space="preserve"> 2.0, scikit-learn 1.3, SHAP 0.44, NumPy 1.26, and Matplotlib 3.8 for figures. Random seeds are fixed at 42 for NumPy, </w:t>
+      </w:r>
+      <w:proofErr w:type="spellStart"/>
+      <w:r>
+        <w:rPr>
+          <w:rFonts w:ascii="Times New Roman" w:hAnsi="Times New Roman" w:cs="Times New Roman"/>
+        </w:rPr>
+        <w:t>PyTorch</w:t>
+      </w:r>
+      <w:proofErr w:type="spellEnd"/>
+      <w:r>
+        <w:rPr>
+          <w:rFonts w:ascii="Times New Roman" w:hAnsi="Times New Roman" w:cs="Times New Roman"/>
+        </w:rPr>
+        <w:t xml:space="preserve"> (CPU and CUDA RNG), and the </w:t>
+      </w:r>
+      <w:proofErr w:type="spellStart"/>
+      <w:r>
+        <w:rPr>
+          <w:rFonts w:ascii="Times New Roman" w:hAnsi="Times New Roman" w:cs="Times New Roman"/>
+        </w:rPr>
+        <w:t>dataloader</w:t>
+      </w:r>
+      <w:proofErr w:type="spellEnd"/>
+      <w:r>
+        <w:rPr>
+          <w:rFonts w:ascii="Times New Roman" w:hAnsi="Times New Roman" w:cs="Times New Roman"/>
+        </w:rPr>
+        <w:t xml:space="preserve"> shuffling order. Training was performed on an NVIDIA RTX 3060 (12 GB) workstation. All code is structured under </w:t>
+      </w:r>
+      <w:proofErr w:type="spellStart"/>
+      <w:r>
+        <w:rPr>
+          <w:rStyle w:val="VerbatimChar"/>
+          <w:rFonts w:ascii="Times New Roman" w:hAnsi="Times New Roman" w:cs="Times New Roman"/>
+        </w:rPr>
+        <w:t>src</w:t>
+      </w:r>
+      <w:proofErr w:type="spellEnd"/>
+      <w:r>
+        <w:rPr>
+          <w:rStyle w:val="VerbatimChar"/>
+          <w:rFonts w:ascii="Times New Roman" w:hAnsi="Times New Roman" w:cs="Times New Roman"/>
+        </w:rPr>
+        <w:t>/</w:t>
+      </w:r>
+      <w:r>
+        <w:rPr>
+          <w:rFonts w:ascii="Times New Roman" w:hAnsi="Times New Roman" w:cs="Times New Roman"/>
+        </w:rPr>
+        <w:t xml:space="preserve"> with the following layout: data loaders and pre-processing under </w:t>
+      </w:r>
+      <w:proofErr w:type="spellStart"/>
+      <w:r>
+        <w:rPr>
+          <w:rStyle w:val="VerbatimChar"/>
+          <w:rFonts w:ascii="Times New Roman" w:hAnsi="Times New Roman" w:cs="Times New Roman"/>
+        </w:rPr>
+        <w:t>src</w:t>
+      </w:r>
+      <w:proofErr w:type="spellEnd"/>
+      <w:r>
+        <w:rPr>
+          <w:rStyle w:val="VerbatimChar"/>
+          <w:rFonts w:ascii="Times New Roman" w:hAnsi="Times New Roman" w:cs="Times New Roman"/>
+        </w:rPr>
+        <w:t>/data/</w:t>
+      </w:r>
+      <w:r>
+        <w:rPr>
+          <w:rFonts w:ascii="Times New Roman" w:hAnsi="Times New Roman" w:cs="Times New Roman"/>
+        </w:rPr>
+        <w:t xml:space="preserve">, model definitions under </w:t>
+      </w:r>
+      <w:proofErr w:type="spellStart"/>
+      <w:r>
+        <w:rPr>
+          <w:rStyle w:val="VerbatimChar"/>
+          <w:rFonts w:ascii="Times New Roman" w:hAnsi="Times New Roman" w:cs="Times New Roman"/>
+        </w:rPr>
+        <w:t>src</w:t>
+      </w:r>
+      <w:proofErr w:type="spellEnd"/>
+      <w:r>
+        <w:rPr>
+          <w:rStyle w:val="VerbatimChar"/>
+          <w:rFonts w:ascii="Times New Roman" w:hAnsi="Times New Roman" w:cs="Times New Roman"/>
+        </w:rPr>
+        <w:t>/models/</w:t>
+      </w:r>
+      <w:r>
+        <w:rPr>
+          <w:rFonts w:ascii="Times New Roman" w:hAnsi="Times New Roman" w:cs="Times New Roman"/>
+        </w:rPr>
+        <w:t xml:space="preserve">, SHAP under </w:t>
+      </w:r>
+      <w:proofErr w:type="spellStart"/>
+      <w:r>
+        <w:rPr>
+          <w:rStyle w:val="VerbatimChar"/>
+          <w:rFonts w:ascii="Times New Roman" w:hAnsi="Times New Roman" w:cs="Times New Roman"/>
+        </w:rPr>
+        <w:t>src</w:t>
+      </w:r>
+      <w:proofErr w:type="spellEnd"/>
+      <w:r>
+        <w:rPr>
+          <w:rStyle w:val="VerbatimChar"/>
+          <w:rFonts w:ascii="Times New Roman" w:hAnsi="Times New Roman" w:cs="Times New Roman"/>
+        </w:rPr>
+        <w:t>/shap_analysis.py</w:t>
+      </w:r>
+      <w:r>
+        <w:rPr>
+          <w:rFonts w:ascii="Times New Roman" w:hAnsi="Times New Roman" w:cs="Times New Roman"/>
+        </w:rPr>
+        <w:t xml:space="preserve">, clinical validation under </w:t>
+      </w:r>
+      <w:proofErr w:type="spellStart"/>
+      <w:r>
+        <w:rPr>
+          <w:rStyle w:val="VerbatimChar"/>
+          <w:rFonts w:ascii="Times New Roman" w:hAnsi="Times New Roman" w:cs="Times New Roman"/>
+        </w:rPr>
+        <w:t>src</w:t>
+      </w:r>
+      <w:proofErr w:type="spellEnd"/>
+      <w:r>
+        <w:rPr>
+          <w:rStyle w:val="VerbatimChar"/>
+          <w:rFonts w:ascii="Times New Roman" w:hAnsi="Times New Roman" w:cs="Times New Roman"/>
+        </w:rPr>
+        <w:t>/clinical_validation.py</w:t>
+      </w:r>
+      <w:r>
+        <w:rPr>
+          <w:rFonts w:ascii="Times New Roman" w:hAnsi="Times New Roman" w:cs="Times New Roman"/>
+        </w:rPr>
+        <w:t xml:space="preserve">, ablation under </w:t>
+      </w:r>
+      <w:proofErr w:type="spellStart"/>
+      <w:r>
+        <w:rPr>
+          <w:rStyle w:val="VerbatimChar"/>
+          <w:rFonts w:ascii="Times New Roman" w:hAnsi="Times New Roman" w:cs="Times New Roman"/>
+        </w:rPr>
+        <w:t>src</w:t>
+      </w:r>
+      <w:proofErr w:type="spellEnd"/>
+      <w:r>
+        <w:rPr>
+          <w:rStyle w:val="VerbatimChar"/>
+          <w:rFonts w:ascii="Times New Roman" w:hAnsi="Times New Roman" w:cs="Times New Roman"/>
+        </w:rPr>
+        <w:t>/ablation_study.py</w:t>
+      </w:r>
+      <w:r>
+        <w:rPr>
+          <w:rFonts w:ascii="Times New Roman" w:hAnsi="Times New Roman" w:cs="Times New Roman"/>
+        </w:rPr>
+        <w:t xml:space="preserve">, and final comparison under </w:t>
+      </w:r>
+      <w:proofErr w:type="spellStart"/>
+      <w:r>
+        <w:rPr>
+          <w:rStyle w:val="VerbatimChar"/>
+          <w:rFonts w:ascii="Times New Roman" w:hAnsi="Times New Roman" w:cs="Times New Roman"/>
+        </w:rPr>
+        <w:t>src</w:t>
+      </w:r>
+      <w:proofErr w:type="spellEnd"/>
+      <w:r>
+        <w:rPr>
+          <w:rStyle w:val="VerbatimChar"/>
+          <w:rFonts w:ascii="Times New Roman" w:hAnsi="Times New Roman" w:cs="Times New Roman"/>
+        </w:rPr>
+        <w:t>/final_comparison.py</w:t>
+      </w:r>
+      <w:r>
+        <w:rPr>
+          <w:rFonts w:ascii="Times New Roman" w:hAnsi="Times New Roman" w:cs="Times New Roman"/>
+        </w:rPr>
+        <w:t xml:space="preserve">. All result JSONs and the figure pack are written to </w:t>
+      </w:r>
+      <w:r>
+        <w:rPr>
+          <w:rStyle w:val="VerbatimChar"/>
+          <w:rFonts w:ascii="Times New Roman" w:hAnsi="Times New Roman" w:cs="Times New Roman"/>
+        </w:rPr>
+        <w:t>outputs/</w:t>
+      </w:r>
+      <w:r>
+        <w:rPr>
+          <w:rFonts w:ascii="Times New Roman" w:hAnsi="Times New Roman" w:cs="Times New Roman"/>
+        </w:rPr>
+        <w:t>.</w:t>
+      </w:r>
+    </w:p>
+    <w:p>
+      <w:pPr>
+        <w:pStyle w:val="BodyText"/>
+        <w:rPr>
+          <w:rFonts w:ascii="Times New Roman" w:hAnsi="Times New Roman" w:cs="Times New Roman"/>
+        </w:rPr>
+      </w:pPr>
+    </w:p>
+    <w:p>
+      <w:pPr>
+        <w:pStyle w:val="BodyText"/>
+        <w:rPr>
+          <w:rFonts w:ascii="Times New Roman" w:hAnsi="Times New Roman" w:cs="Times New Roman"/>
+        </w:rPr>
+      </w:pPr>
+    </w:p>
+    <w:p>
+      <w:pPr>
+        <w:pStyle w:val="BodyText"/>
+        <w:rPr>
+          <w:rFonts w:ascii="Times New Roman" w:hAnsi="Times New Roman" w:cs="Times New Roman"/>
+        </w:rPr>
+      </w:pPr>
+    </w:p>
+    <w:p>
+      <w:pPr>
+        <w:pStyle w:val="BodyText"/>
+        <w:rPr>
+          <w:rFonts w:ascii="Times New Roman" w:hAnsi="Times New Roman" w:cs="Times New Roman"/>
+        </w:rPr>
+      </w:pPr>
+    </w:p>
+    <w:p>
+      <w:pPr>
+        <w:pStyle w:val="BodyText"/>
+        <w:rPr>
+          <w:rFonts w:ascii="Times New Roman" w:hAnsi="Times New Roman" w:cs="Times New Roman"/>
+        </w:rPr>
+      </w:pPr>
+    </w:p>
+    <w:p>
+      <w:pPr>
+        <w:pStyle w:val="BodyText"/>
+        <w:rPr>
+          <w:rFonts w:ascii="Times New Roman" w:hAnsi="Times New Roman" w:cs="Times New Roman"/>
+        </w:rPr>
+      </w:pPr>
+    </w:p>
+    <w:p>
+      <w:pPr>
+        <w:pStyle w:val="BodyText"/>
+        <w:rPr>
+          <w:rFonts w:ascii="Times New Roman" w:hAnsi="Times New Roman" w:cs="Times New Roman"/>
+        </w:rPr>
+      </w:pPr>
+    </w:p>
+    <w:p>
+      <w:pPr>
+        <w:pStyle w:val="BodyText"/>
+        <w:rPr>
+          <w:rFonts w:ascii="Times New Roman" w:hAnsi="Times New Roman" w:cs="Times New Roman"/>
+        </w:rPr>
+      </w:pPr>
+    </w:p>
+    <w:p>
+      <w:pPr>
+        <w:pStyle w:val="BodyText"/>
+        <w:rPr>
+          <w:rFonts w:ascii="Times New Roman" w:hAnsi="Times New Roman" w:cs="Times New Roman"/>
+        </w:rPr>
+      </w:pPr>
+    </w:p>
+    <w:p>
+      <w:pPr>
+        <w:pStyle w:val="BodyText"/>
+        <w:rPr>
+          <w:rFonts w:ascii="Times New Roman" w:hAnsi="Times New Roman" w:cs="Times New Roman"/>
+        </w:rPr>
+      </w:pPr>
+    </w:p>
+    <w:p>
+      <w:pPr>
+        <w:pStyle w:val="BodyText"/>
+        <w:rPr>
+          <w:rFonts w:ascii="Times New Roman" w:hAnsi="Times New Roman" w:cs="Times New Roman"/>
+        </w:rPr>
+      </w:pPr>
+    </w:p>
+    <w:p>
+      <w:pPr>
+        <w:pStyle w:val="BodyText"/>
+        <w:rPr>
+          <w:rFonts w:ascii="Times New Roman" w:hAnsi="Times New Roman" w:cs="Times New Roman"/>
+        </w:rPr>
+      </w:pPr>
+    </w:p>
+    <w:p>
+      <w:pPr>
+        <w:pStyle w:val="BodyText"/>
+        <w:rPr>
+          <w:rFonts w:ascii="Times New Roman" w:hAnsi="Times New Roman" w:cs="Times New Roman"/>
+        </w:rPr>
+      </w:pPr>
+    </w:p>
+    <w:p>
+      <w:pPr>
+        <w:pStyle w:val="BodyText"/>
+        <w:rPr>
+          <w:rFonts w:ascii="Times New Roman" w:hAnsi="Times New Roman" w:cs="Times New Roman"/>
+        </w:rPr>
+      </w:pPr>
+    </w:p>
+    <w:p>
+      <w:pPr>
+        <w:pStyle w:val="BodyText"/>
+        <w:rPr>
+          <w:rFonts w:ascii="Times New Roman" w:hAnsi="Times New Roman" w:cs="Times New Roman"/>
+        </w:rPr>
+      </w:pPr>
+    </w:p>
+    <w:p>
+      <w:pPr>
+        <w:pStyle w:val="BodyText"/>
+        <w:rPr>
+          <w:rFonts w:ascii="Times New Roman" w:hAnsi="Times New Roman" w:cs="Times New Roman"/>
+        </w:rPr>
+      </w:pPr>
+    </w:p>
+    <w:p>
+      <w:pPr>
+        <w:pStyle w:val="BodyText"/>
+        <w:rPr>
+          <w:rFonts w:ascii="Times New Roman" w:hAnsi="Times New Roman" w:cs="Times New Roman"/>
+        </w:rPr>
+      </w:pPr>
+    </w:p>
+    <w:p>
+      <w:pPr>
+        <w:pStyle w:val="Heading1"/>
+        <w:jc w:val="both"/>
+        <w:rPr>
+          <w:rFonts w:ascii="Times New Roman" w:hAnsi="Times New Roman" w:cs="Times New Roman"/>
+        </w:rPr>
+      </w:pPr>
+      <w:bookmarkStart w:id="91" w:name="X8ed3c865cebddc4c9b93da40ad3594ddb8eb486"/>
+      <w:bookmarkEnd w:id="53"/>
       <w:bookmarkEnd w:id="90"/>
     </w:p>
     <w:p>
       <w:pPr>
+        <w:pStyle w:val="Heading1"/>
+        <w:jc w:val="both"/>
+        <w:rPr>
+          <w:rFonts w:ascii="Times New Roman" w:hAnsi="Times New Roman" w:cs="Times New Roman"/>
+        </w:rPr>
+      </w:pPr>
+      <w:bookmarkStart w:id="92" w:name="_Toc229867201"/>
+      <w:r>
+        <w:rPr>
+          <w:rFonts w:ascii="Times New Roman" w:hAnsi="Times New Roman" w:cs="Times New Roman"/>
+        </w:rPr>
+        <w:t>CHAPTER 3. RESULTS, FINDINGS, AND DISCUSSION</w:t>
+      </w:r>
+      <w:bookmarkEnd w:id="92"/>
+    </w:p>
+    <w:p>
+      <w:pPr>
         <w:pStyle w:val="FirstParagraph"/>
         <w:jc w:val="both"/>
         <w:rPr>
@@ -10959,409 +11360,6 @@
         <w:rPr>
           <w:rFonts w:ascii="Times New Roman" w:hAnsi="Times New Roman" w:cs="Times New Roman"/>
         </w:rPr>
-        <w:t xml:space="preserve">All experiments are implemented in Python 3.11 with </w:t>
-      </w:r>
-      <w:proofErr w:type="spellStart"/>
-      <w:r>
-        <w:rPr>
-          <w:rFonts w:ascii="Times New Roman" w:hAnsi="Times New Roman" w:cs="Times New Roman"/>
-        </w:rPr>
-        <w:t>PyTorch</w:t>
-      </w:r>
-      <w:proofErr w:type="spellEnd"/>
-      <w:r>
-        <w:rPr>
-          <w:rFonts w:ascii="Times New Roman" w:hAnsi="Times New Roman" w:cs="Times New Roman"/>
-        </w:rPr>
-        <w:t xml:space="preserve"> 2.1, </w:t>
-      </w:r>
-      <w:proofErr w:type="spellStart"/>
-      <w:r>
-        <w:rPr>
-          <w:rFonts w:ascii="Times New Roman" w:hAnsi="Times New Roman" w:cs="Times New Roman"/>
-        </w:rPr>
-        <w:t>XGBoost</w:t>
-      </w:r>
-      <w:proofErr w:type="spellEnd"/>
-      <w:r>
-        <w:rPr>
-          <w:rFonts w:ascii="Times New Roman" w:hAnsi="Times New Roman" w:cs="Times New Roman"/>
-        </w:rPr>
-        <w:t xml:space="preserve"> 2.0, scikit-learn 1.3, SHAP 0.44, NumPy 1.26, and Matplotlib 3.8 for figures. Random seeds are fixed at 42 for NumPy, </w:t>
-      </w:r>
-      <w:proofErr w:type="spellStart"/>
-      <w:r>
-        <w:rPr>
-          <w:rFonts w:ascii="Times New Roman" w:hAnsi="Times New Roman" w:cs="Times New Roman"/>
-        </w:rPr>
-        <w:t>PyTorch</w:t>
-      </w:r>
-      <w:proofErr w:type="spellEnd"/>
-      <w:r>
-        <w:rPr>
-          <w:rFonts w:ascii="Times New Roman" w:hAnsi="Times New Roman" w:cs="Times New Roman"/>
-        </w:rPr>
-        <w:t xml:space="preserve"> (CPU and CUDA RNG), and the </w:t>
-      </w:r>
-      <w:proofErr w:type="spellStart"/>
-      <w:r>
-        <w:rPr>
-          <w:rFonts w:ascii="Times New Roman" w:hAnsi="Times New Roman" w:cs="Times New Roman"/>
-        </w:rPr>
-        <w:t>dataloader</w:t>
-      </w:r>
-      <w:proofErr w:type="spellEnd"/>
-      <w:r>
-        <w:rPr>
-          <w:rFonts w:ascii="Times New Roman" w:hAnsi="Times New Roman" w:cs="Times New Roman"/>
-        </w:rPr>
-        <w:t xml:space="preserve"> shuffling order. Training was performed on an NVIDIA RTX 3060 (12 GB) workstation. All code is structured under </w:t>
-      </w:r>
-      <w:proofErr w:type="spellStart"/>
-      <w:r>
-        <w:rPr>
-          <w:rStyle w:val="VerbatimChar"/>
-          <w:rFonts w:ascii="Times New Roman" w:hAnsi="Times New Roman" w:cs="Times New Roman"/>
-        </w:rPr>
-        <w:t>src</w:t>
-      </w:r>
-      <w:proofErr w:type="spellEnd"/>
-      <w:r>
-        <w:rPr>
-          <w:rStyle w:val="VerbatimChar"/>
-          <w:rFonts w:ascii="Times New Roman" w:hAnsi="Times New Roman" w:cs="Times New Roman"/>
-        </w:rPr>
-        <w:t>/</w:t>
-      </w:r>
-      <w:r>
-        <w:rPr>
-          <w:rFonts w:ascii="Times New Roman" w:hAnsi="Times New Roman" w:cs="Times New Roman"/>
-        </w:rPr>
-        <w:t xml:space="preserve"> with the following layout: data loaders and pre-processing under </w:t>
-      </w:r>
-      <w:proofErr w:type="spellStart"/>
-      <w:r>
-        <w:rPr>
-          <w:rStyle w:val="VerbatimChar"/>
-          <w:rFonts w:ascii="Times New Roman" w:hAnsi="Times New Roman" w:cs="Times New Roman"/>
-        </w:rPr>
-        <w:t>src</w:t>
-      </w:r>
-      <w:proofErr w:type="spellEnd"/>
-      <w:r>
-        <w:rPr>
-          <w:rStyle w:val="VerbatimChar"/>
-          <w:rFonts w:ascii="Times New Roman" w:hAnsi="Times New Roman" w:cs="Times New Roman"/>
-        </w:rPr>
-        <w:t>/data/</w:t>
-      </w:r>
-      <w:r>
-        <w:rPr>
-          <w:rFonts w:ascii="Times New Roman" w:hAnsi="Times New Roman" w:cs="Times New Roman"/>
-        </w:rPr>
-        <w:t xml:space="preserve">, model definitions under </w:t>
-      </w:r>
-      <w:proofErr w:type="spellStart"/>
-      <w:r>
-        <w:rPr>
-          <w:rStyle w:val="VerbatimChar"/>
-          <w:rFonts w:ascii="Times New Roman" w:hAnsi="Times New Roman" w:cs="Times New Roman"/>
-        </w:rPr>
-        <w:t>src</w:t>
-      </w:r>
-      <w:proofErr w:type="spellEnd"/>
-      <w:r>
-        <w:rPr>
-          <w:rStyle w:val="VerbatimChar"/>
-          <w:rFonts w:ascii="Times New Roman" w:hAnsi="Times New Roman" w:cs="Times New Roman"/>
-        </w:rPr>
-        <w:t>/models/</w:t>
-      </w:r>
-      <w:r>
-        <w:rPr>
-          <w:rFonts w:ascii="Times New Roman" w:hAnsi="Times New Roman" w:cs="Times New Roman"/>
-        </w:rPr>
-        <w:t xml:space="preserve">, SHAP under </w:t>
-      </w:r>
-      <w:proofErr w:type="spellStart"/>
-      <w:r>
-        <w:rPr>
-          <w:rStyle w:val="VerbatimChar"/>
-          <w:rFonts w:ascii="Times New Roman" w:hAnsi="Times New Roman" w:cs="Times New Roman"/>
-        </w:rPr>
-        <w:t>src</w:t>
-      </w:r>
-      <w:proofErr w:type="spellEnd"/>
-      <w:r>
-        <w:rPr>
-          <w:rStyle w:val="VerbatimChar"/>
-          <w:rFonts w:ascii="Times New Roman" w:hAnsi="Times New Roman" w:cs="Times New Roman"/>
-        </w:rPr>
-        <w:t>/shap_analysis.py</w:t>
-      </w:r>
-      <w:r>
-        <w:rPr>
-          <w:rFonts w:ascii="Times New Roman" w:hAnsi="Times New Roman" w:cs="Times New Roman"/>
-        </w:rPr>
-        <w:t xml:space="preserve">, clinical validation under </w:t>
-      </w:r>
-      <w:proofErr w:type="spellStart"/>
-      <w:r>
-        <w:rPr>
-          <w:rStyle w:val="VerbatimChar"/>
-          <w:rFonts w:ascii="Times New Roman" w:hAnsi="Times New Roman" w:cs="Times New Roman"/>
-        </w:rPr>
-        <w:t>src</w:t>
-      </w:r>
-      <w:proofErr w:type="spellEnd"/>
-      <w:r>
-        <w:rPr>
-          <w:rStyle w:val="VerbatimChar"/>
-          <w:rFonts w:ascii="Times New Roman" w:hAnsi="Times New Roman" w:cs="Times New Roman"/>
-        </w:rPr>
-        <w:t>/clinical_validation.py</w:t>
-      </w:r>
-      <w:r>
-        <w:rPr>
-          <w:rFonts w:ascii="Times New Roman" w:hAnsi="Times New Roman" w:cs="Times New Roman"/>
-        </w:rPr>
-        <w:t xml:space="preserve">, ablation under </w:t>
-      </w:r>
-      <w:proofErr w:type="spellStart"/>
-      <w:r>
-        <w:rPr>
-          <w:rStyle w:val="VerbatimChar"/>
-          <w:rFonts w:ascii="Times New Roman" w:hAnsi="Times New Roman" w:cs="Times New Roman"/>
-        </w:rPr>
-        <w:t>src</w:t>
-      </w:r>
-      <w:proofErr w:type="spellEnd"/>
-      <w:r>
-        <w:rPr>
-          <w:rStyle w:val="VerbatimChar"/>
-          <w:rFonts w:ascii="Times New Roman" w:hAnsi="Times New Roman" w:cs="Times New Roman"/>
-        </w:rPr>
-        <w:t>/ablation_study.py</w:t>
-      </w:r>
-      <w:r>
-        <w:rPr>
-          <w:rFonts w:ascii="Times New Roman" w:hAnsi="Times New Roman" w:cs="Times New Roman"/>
-        </w:rPr>
-        <w:t xml:space="preserve">, and final comparison under </w:t>
-      </w:r>
-      <w:proofErr w:type="spellStart"/>
-      <w:r>
-        <w:rPr>
-          <w:rStyle w:val="VerbatimChar"/>
-          <w:rFonts w:ascii="Times New Roman" w:hAnsi="Times New Roman" w:cs="Times New Roman"/>
-        </w:rPr>
-        <w:t>src</w:t>
-      </w:r>
-      <w:proofErr w:type="spellEnd"/>
-      <w:r>
-        <w:rPr>
-          <w:rStyle w:val="VerbatimChar"/>
-          <w:rFonts w:ascii="Times New Roman" w:hAnsi="Times New Roman" w:cs="Times New Roman"/>
-        </w:rPr>
-        <w:t>/final_comparison.py</w:t>
-      </w:r>
-      <w:r>
-        <w:rPr>
-          <w:rFonts w:ascii="Times New Roman" w:hAnsi="Times New Roman" w:cs="Times New Roman"/>
-        </w:rPr>
-        <w:t xml:space="preserve">. All result JSONs and the figure pack are written to </w:t>
-      </w:r>
-      <w:r>
-        <w:rPr>
-          <w:rStyle w:val="VerbatimChar"/>
-          <w:rFonts w:ascii="Times New Roman" w:hAnsi="Times New Roman" w:cs="Times New Roman"/>
-        </w:rPr>
-        <w:t>outputs/</w:t>
-      </w:r>
-      <w:r>
-        <w:rPr>
-          <w:rFonts w:ascii="Times New Roman" w:hAnsi="Times New Roman" w:cs="Times New Roman"/>
-        </w:rPr>
-        <w:t>.</w:t>
-      </w:r>
-    </w:p>
-    <w:p>
-      <w:pPr>
-        <w:pStyle w:val="BodyText"/>
-        <w:rPr>
-          <w:rFonts w:ascii="Times New Roman" w:hAnsi="Times New Roman" w:cs="Times New Roman"/>
-        </w:rPr>
-      </w:pPr>
-    </w:p>
-    <w:p>
-      <w:pPr>
-        <w:pStyle w:val="BodyText"/>
-        <w:rPr>
-          <w:rFonts w:ascii="Times New Roman" w:hAnsi="Times New Roman" w:cs="Times New Roman"/>
-        </w:rPr>
-      </w:pPr>
-    </w:p>
-    <w:p>
-      <w:pPr>
-        <w:pStyle w:val="BodyText"/>
-        <w:rPr>
-          <w:rFonts w:ascii="Times New Roman" w:hAnsi="Times New Roman" w:cs="Times New Roman"/>
-        </w:rPr>
-      </w:pPr>
-    </w:p>
-    <w:p>
-      <w:pPr>
-        <w:pStyle w:val="BodyText"/>
-        <w:rPr>
-          <w:rFonts w:ascii="Times New Roman" w:hAnsi="Times New Roman" w:cs="Times New Roman"/>
-        </w:rPr>
-      </w:pPr>
-    </w:p>
-    <w:p>
-      <w:pPr>
-        <w:pStyle w:val="BodyText"/>
-        <w:rPr>
-          <w:rFonts w:ascii="Times New Roman" w:hAnsi="Times New Roman" w:cs="Times New Roman"/>
-        </w:rPr>
-      </w:pPr>
-    </w:p>
-    <w:p>
-      <w:pPr>
-        <w:pStyle w:val="BodyText"/>
-        <w:rPr>
-          <w:rFonts w:ascii="Times New Roman" w:hAnsi="Times New Roman" w:cs="Times New Roman"/>
-        </w:rPr>
-      </w:pPr>
-    </w:p>
-    <w:p>
-      <w:pPr>
-        <w:pStyle w:val="BodyText"/>
-        <w:rPr>
-          <w:rFonts w:ascii="Times New Roman" w:hAnsi="Times New Roman" w:cs="Times New Roman"/>
-        </w:rPr>
-      </w:pPr>
-    </w:p>
-    <w:p>
-      <w:pPr>
-        <w:pStyle w:val="BodyText"/>
-        <w:rPr>
-          <w:rFonts w:ascii="Times New Roman" w:hAnsi="Times New Roman" w:cs="Times New Roman"/>
-        </w:rPr>
-      </w:pPr>
-    </w:p>
-    <w:p>
-      <w:pPr>
-        <w:pStyle w:val="BodyText"/>
-        <w:rPr>
-          <w:rFonts w:ascii="Times New Roman" w:hAnsi="Times New Roman" w:cs="Times New Roman"/>
-        </w:rPr>
-      </w:pPr>
-    </w:p>
-    <w:p>
-      <w:pPr>
-        <w:pStyle w:val="BodyText"/>
-        <w:rPr>
-          <w:rFonts w:ascii="Times New Roman" w:hAnsi="Times New Roman" w:cs="Times New Roman"/>
-        </w:rPr>
-      </w:pPr>
-    </w:p>
-    <w:p>
-      <w:pPr>
-        <w:pStyle w:val="BodyText"/>
-        <w:rPr>
-          <w:rFonts w:ascii="Times New Roman" w:hAnsi="Times New Roman" w:cs="Times New Roman"/>
-        </w:rPr>
-      </w:pPr>
-    </w:p>
-    <w:p>
-      <w:pPr>
-        <w:pStyle w:val="BodyText"/>
-        <w:rPr>
-          <w:rFonts w:ascii="Times New Roman" w:hAnsi="Times New Roman" w:cs="Times New Roman"/>
-        </w:rPr>
-      </w:pPr>
-    </w:p>
-    <w:p>
-      <w:pPr>
-        <w:pStyle w:val="BodyText"/>
-        <w:rPr>
-          <w:rFonts w:ascii="Times New Roman" w:hAnsi="Times New Roman" w:cs="Times New Roman"/>
-        </w:rPr>
-      </w:pPr>
-    </w:p>
-    <w:p>
-      <w:pPr>
-        <w:pStyle w:val="BodyText"/>
-        <w:rPr>
-          <w:rFonts w:ascii="Times New Roman" w:hAnsi="Times New Roman" w:cs="Times New Roman"/>
-        </w:rPr>
-      </w:pPr>
-    </w:p>
-    <w:p>
-      <w:pPr>
-        <w:pStyle w:val="BodyText"/>
-        <w:rPr>
-          <w:rFonts w:ascii="Times New Roman" w:hAnsi="Times New Roman" w:cs="Times New Roman"/>
-        </w:rPr>
-      </w:pPr>
-    </w:p>
-    <w:p>
-      <w:pPr>
-        <w:pStyle w:val="BodyText"/>
-        <w:rPr>
-          <w:rFonts w:ascii="Times New Roman" w:hAnsi="Times New Roman" w:cs="Times New Roman"/>
-        </w:rPr>
-      </w:pPr>
-    </w:p>
-    <w:p>
-      <w:pPr>
-        <w:pStyle w:val="BodyText"/>
-        <w:rPr>
-          <w:rFonts w:ascii="Times New Roman" w:hAnsi="Times New Roman" w:cs="Times New Roman"/>
-        </w:rPr>
-      </w:pPr>
-    </w:p>
-    <w:p>
-      <w:pPr>
-        <w:pStyle w:val="Heading1"/>
-        <w:jc w:val="both"/>
-        <w:rPr>
-          <w:rFonts w:ascii="Times New Roman" w:hAnsi="Times New Roman" w:cs="Times New Roman"/>
-        </w:rPr>
-      </w:pPr>
-      <w:bookmarkStart w:id="91" w:name="X8ed3c865cebddc4c9b93da40ad3594ddb8eb486"/>
-      <w:bookmarkEnd w:id="52"/>
-      <w:bookmarkEnd w:id="89"/>
-    </w:p>
-    <w:p>
-      <w:pPr>
-        <w:pStyle w:val="Heading1"/>
-        <w:jc w:val="both"/>
-        <w:rPr>
-          <w:rFonts w:ascii="Times New Roman" w:hAnsi="Times New Roman" w:cs="Times New Roman"/>
-        </w:rPr>
-      </w:pPr>
-      <w:bookmarkStart w:id="92" w:name="_Toc229867201"/>
-      <w:r>
-        <w:rPr>
-          <w:rFonts w:ascii="Times New Roman" w:hAnsi="Times New Roman" w:cs="Times New Roman"/>
-        </w:rPr>
-        <w:t>CHAPTER 3. RESULTS, FINDINGS, AND DISCUSSION</w:t>
-      </w:r>
-      <w:bookmarkEnd w:id="92"/>
-    </w:p>
-    <w:p>
-      <w:pPr>
-        <w:pStyle w:val="FirstParagraph"/>
-        <w:jc w:val="both"/>
-        <w:rPr>
-          <w:rFonts w:ascii="Times New Roman" w:hAnsi="Times New Roman" w:cs="Times New Roman"/>
-        </w:rPr>
-      </w:pPr>
-      <w:r>
-        <w:rPr>
-          <w:rFonts w:ascii="Times New Roman" w:hAnsi="Times New Roman" w:cs="Times New Roman"/>
-        </w:rPr>
         <w:t xml:space="preserve">This chapter presents the experimental results in the order in which the corresponding questions appeared in the Introduction. Section 3.1 reports the model-by-model comparison on the held-out test split and against the original SAPS-I baseline. Section 3.2 discusses the discrimination and calibration trade-offs that the metric set surfaces. Section 3.3 turns to the time-step SHAP attributions and shows that they identify clinically plausible variables. Section 3.4 walks through two illustrative patient case studies. Section 3.5 reports attention-head </w:t>
       </w:r>
       <w:proofErr w:type="spellStart"/>
@@ -11387,15 +11385,15 @@
           <w:rFonts w:ascii="Times New Roman" w:hAnsi="Times New Roman" w:cs="Times New Roman"/>
         </w:rPr>
       </w:pPr>
-      <w:bookmarkStart w:id="93" w:name="comparative-performance-on-set-a"/>
-      <w:bookmarkStart w:id="94" w:name="_Toc229867202"/>
+      <w:bookmarkStart w:id="93" w:name="_Toc229867202"/>
+      <w:bookmarkStart w:id="94" w:name="comparative-performance-on-set-a"/>
       <w:r>
         <w:rPr>
           <w:rFonts w:ascii="Times New Roman" w:hAnsi="Times New Roman" w:cs="Times New Roman"/>
         </w:rPr>
         <w:t>3.1 Comparative performance on Set-A</w:t>
       </w:r>
-      <w:bookmarkEnd w:id="94"/>
+      <w:bookmarkEnd w:id="93"/>
     </w:p>
     <w:p>
       <w:pPr>
@@ -12416,158 +12414,158 @@
           <w:rFonts w:ascii="Times New Roman" w:hAnsi="Times New Roman" w:cs="Times New Roman"/>
         </w:rPr>
       </w:pPr>
-      <w:bookmarkStart w:id="95" w:name="discrimination-versus-calibration"/>
-      <w:bookmarkStart w:id="96" w:name="_Toc229867203"/>
-      <w:bookmarkEnd w:id="93"/>
+      <w:bookmarkStart w:id="95" w:name="_Toc229867203"/>
+      <w:bookmarkStart w:id="96" w:name="discrimination-versus-calibration"/>
+      <w:bookmarkEnd w:id="94"/>
       <w:r>
         <w:rPr>
           <w:rFonts w:ascii="Times New Roman" w:hAnsi="Times New Roman" w:cs="Times New Roman"/>
         </w:rPr>
         <w:t>3.2 Discrimination versus calibration</w:t>
       </w:r>
+      <w:bookmarkEnd w:id="95"/>
+    </w:p>
+    <w:p>
+      <w:pPr>
+        <w:pStyle w:val="FirstParagraph"/>
+        <w:jc w:val="both"/>
+        <w:rPr>
+          <w:rFonts w:ascii="Times New Roman" w:hAnsi="Times New Roman" w:cs="Times New Roman"/>
+        </w:rPr>
+      </w:pPr>
+      <w:r>
+        <w:rPr>
+          <w:rFonts w:ascii="Times New Roman" w:hAnsi="Times New Roman" w:cs="Times New Roman"/>
+        </w:rPr>
+        <w:t xml:space="preserve">The AUROC ordering — </w:t>
+      </w:r>
+      <w:proofErr w:type="spellStart"/>
+      <w:r>
+        <w:rPr>
+          <w:rFonts w:ascii="Times New Roman" w:hAnsi="Times New Roman" w:cs="Times New Roman"/>
+        </w:rPr>
+        <w:t>XGBoost</w:t>
+      </w:r>
+      <w:proofErr w:type="spellEnd"/>
+      <w:r>
+        <w:rPr>
+          <w:rFonts w:ascii="Times New Roman" w:hAnsi="Times New Roman" w:cs="Times New Roman"/>
+        </w:rPr>
+        <w:t xml:space="preserve"> (0.8798) &gt; Transformer (0.8542) &gt; TCN (0.8191) — and the AUPRC ordering match for the top two. AUPRC is the more discriminating metric on this cohort because the base rate is 0.135, so an uninformative classifier achieves AUPRC ≈ 0.135 while AUROC ≈ 0.50; the gap between 0.135 and 0.538 (</w:t>
+      </w:r>
+      <w:proofErr w:type="spellStart"/>
+      <w:r>
+        <w:rPr>
+          <w:rFonts w:ascii="Times New Roman" w:hAnsi="Times New Roman" w:cs="Times New Roman"/>
+        </w:rPr>
+        <w:t>XGBoost</w:t>
+      </w:r>
+      <w:proofErr w:type="spellEnd"/>
+      <w:r>
+        <w:rPr>
+          <w:rFonts w:ascii="Times New Roman" w:hAnsi="Times New Roman" w:cs="Times New Roman"/>
+        </w:rPr>
+        <w:t>) is therefore a more honest measure of modelling gain than the gap from 0.50 to 0.88.</w:t>
+      </w:r>
+    </w:p>
+    <w:p>
+      <w:pPr>
+        <w:pStyle w:val="BodyText"/>
+        <w:jc w:val="both"/>
+        <w:rPr>
+          <w:rFonts w:ascii="Times New Roman" w:hAnsi="Times New Roman" w:cs="Times New Roman"/>
+        </w:rPr>
+      </w:pPr>
+      <w:r>
+        <w:rPr>
+          <w:rFonts w:ascii="Times New Roman" w:hAnsi="Times New Roman" w:cs="Times New Roman"/>
+        </w:rPr>
+        <w:t xml:space="preserve">The Score1 ordering follows AUROC closely. Score1 is </w:t>
+      </w:r>
+      <w:proofErr w:type="gramStart"/>
+      <w:r>
+        <w:rPr>
+          <w:rStyle w:val="VerbatimChar"/>
+          <w:rFonts w:ascii="Times New Roman" w:hAnsi="Times New Roman" w:cs="Times New Roman"/>
+        </w:rPr>
+        <w:t>min(</w:t>
+      </w:r>
+      <w:proofErr w:type="gramEnd"/>
+      <w:r>
+        <w:rPr>
+          <w:rStyle w:val="VerbatimChar"/>
+          <w:rFonts w:ascii="Times New Roman" w:hAnsi="Times New Roman" w:cs="Times New Roman"/>
+        </w:rPr>
+        <w:t>Sensitivity, +Predictivity)</w:t>
+      </w:r>
+      <w:r>
+        <w:rPr>
+          <w:rFonts w:ascii="Times New Roman" w:hAnsi="Times New Roman" w:cs="Times New Roman"/>
+        </w:rPr>
+        <w:t xml:space="preserve"> at the optimal threshold, and Table 3.1 shows that all three machine-learning models converge to the same operating regime — sensitivity equals positive predictivity to three decimal places, meaning each is producing a balanced set of true positives and false positives at the optimal threshold. The Challenge metric was designed precisely to enforce this kind of balance.</w:t>
+      </w:r>
+    </w:p>
+    <w:p>
+      <w:pPr>
+        <w:pStyle w:val="BodyText"/>
+        <w:jc w:val="both"/>
+        <w:rPr>
+          <w:rFonts w:ascii="Times New Roman" w:hAnsi="Times New Roman" w:cs="Times New Roman"/>
+        </w:rPr>
+      </w:pPr>
+      <w:r>
+        <w:rPr>
+          <w:rFonts w:ascii="Times New Roman" w:hAnsi="Times New Roman" w:cs="Times New Roman"/>
+        </w:rPr>
+        <w:t>The Hosmer–</w:t>
+      </w:r>
+      <w:proofErr w:type="spellStart"/>
+      <w:r>
+        <w:rPr>
+          <w:rFonts w:ascii="Times New Roman" w:hAnsi="Times New Roman" w:cs="Times New Roman"/>
+        </w:rPr>
+        <w:t>Lemeshow</w:t>
+      </w:r>
+      <w:proofErr w:type="spellEnd"/>
+      <w:r>
+        <w:rPr>
+          <w:rFonts w:ascii="Times New Roman" w:hAnsi="Times New Roman" w:cs="Times New Roman"/>
+        </w:rPr>
+        <w:t xml:space="preserve"> statistic tells a different story. </w:t>
+      </w:r>
+      <w:proofErr w:type="spellStart"/>
+      <w:r>
+        <w:rPr>
+          <w:rFonts w:ascii="Times New Roman" w:hAnsi="Times New Roman" w:cs="Times New Roman"/>
+        </w:rPr>
+        <w:t>XGBoost</w:t>
+      </w:r>
+      <w:proofErr w:type="spellEnd"/>
+      <w:r>
+        <w:rPr>
+          <w:rFonts w:ascii="Times New Roman" w:hAnsi="Times New Roman" w:cs="Times New Roman"/>
+        </w:rPr>
+        <w:t xml:space="preserve"> is well-calibrated (HL-H = 37.67, close to the SAPS-I value of 35.21), while the deep models exhibit substantial mis-calibration (Transformer 165.17, TCN 205.78). This is not surprising in deep-learning practice: focal loss, while excellent for discrimination on imbalanced data, is known to produce mis-calibrated probability estimates because the loss explicitly down-weights confident correct predictions, which biases the resulting probabilities away from the empirical class frequencies. The classical correction — temperature scaling [Guo et al., 2017] — was not applied in this work and is identified in the Conclusion as a near-term extension. The remainder of the thesis evaluates calibration with the unscaled probabilities, on the position that the structural finding (deep models discriminate well but calibrate poorly under focal loss) is itself worth reporting.</w:t>
+      </w:r>
+    </w:p>
+    <w:p>
+      <w:pPr>
+        <w:pStyle w:val="Heading2"/>
+        <w:jc w:val="both"/>
+        <w:rPr>
+          <w:rFonts w:ascii="Times New Roman" w:hAnsi="Times New Roman" w:cs="Times New Roman"/>
+        </w:rPr>
+      </w:pPr>
+      <w:bookmarkStart w:id="97" w:name="_Toc229867204"/>
+      <w:bookmarkStart w:id="98" w:name="time-step-shap-global-findings"/>
       <w:bookmarkEnd w:id="96"/>
-    </w:p>
-    <w:p>
-      <w:pPr>
-        <w:pStyle w:val="FirstParagraph"/>
-        <w:jc w:val="both"/>
-        <w:rPr>
-          <w:rFonts w:ascii="Times New Roman" w:hAnsi="Times New Roman" w:cs="Times New Roman"/>
-        </w:rPr>
-      </w:pPr>
-      <w:r>
-        <w:rPr>
-          <w:rFonts w:ascii="Times New Roman" w:hAnsi="Times New Roman" w:cs="Times New Roman"/>
-        </w:rPr>
-        <w:t xml:space="preserve">The AUROC ordering — </w:t>
-      </w:r>
-      <w:proofErr w:type="spellStart"/>
-      <w:r>
-        <w:rPr>
-          <w:rFonts w:ascii="Times New Roman" w:hAnsi="Times New Roman" w:cs="Times New Roman"/>
-        </w:rPr>
-        <w:t>XGBoost</w:t>
-      </w:r>
-      <w:proofErr w:type="spellEnd"/>
-      <w:r>
-        <w:rPr>
-          <w:rFonts w:ascii="Times New Roman" w:hAnsi="Times New Roman" w:cs="Times New Roman"/>
-        </w:rPr>
-        <w:t xml:space="preserve"> (0.8798) &gt; Transformer (0.8542) &gt; TCN (0.8191) — and the AUPRC ordering match for the top two. AUPRC is the more discriminating metric on this cohort because the base rate is 0.135, so an uninformative classifier achieves AUPRC ≈ 0.135 while AUROC ≈ 0.50; the gap between 0.135 and 0.538 (</w:t>
-      </w:r>
-      <w:proofErr w:type="spellStart"/>
-      <w:r>
-        <w:rPr>
-          <w:rFonts w:ascii="Times New Roman" w:hAnsi="Times New Roman" w:cs="Times New Roman"/>
-        </w:rPr>
-        <w:t>XGBoost</w:t>
-      </w:r>
-      <w:proofErr w:type="spellEnd"/>
-      <w:r>
-        <w:rPr>
-          <w:rFonts w:ascii="Times New Roman" w:hAnsi="Times New Roman" w:cs="Times New Roman"/>
-        </w:rPr>
-        <w:t>) is therefore a more honest measure of modelling gain than the gap from 0.50 to 0.88.</w:t>
-      </w:r>
-    </w:p>
-    <w:p>
-      <w:pPr>
-        <w:pStyle w:val="BodyText"/>
-        <w:jc w:val="both"/>
-        <w:rPr>
-          <w:rFonts w:ascii="Times New Roman" w:hAnsi="Times New Roman" w:cs="Times New Roman"/>
-        </w:rPr>
-      </w:pPr>
-      <w:r>
-        <w:rPr>
-          <w:rFonts w:ascii="Times New Roman" w:hAnsi="Times New Roman" w:cs="Times New Roman"/>
-        </w:rPr>
-        <w:t xml:space="preserve">The Score1 ordering follows AUROC closely. Score1 is </w:t>
-      </w:r>
-      <w:proofErr w:type="gramStart"/>
-      <w:r>
-        <w:rPr>
-          <w:rStyle w:val="VerbatimChar"/>
-          <w:rFonts w:ascii="Times New Roman" w:hAnsi="Times New Roman" w:cs="Times New Roman"/>
-        </w:rPr>
-        <w:t>min(</w:t>
-      </w:r>
-      <w:proofErr w:type="gramEnd"/>
-      <w:r>
-        <w:rPr>
-          <w:rStyle w:val="VerbatimChar"/>
-          <w:rFonts w:ascii="Times New Roman" w:hAnsi="Times New Roman" w:cs="Times New Roman"/>
-        </w:rPr>
-        <w:t>Sensitivity, +Predictivity)</w:t>
-      </w:r>
-      <w:r>
-        <w:rPr>
-          <w:rFonts w:ascii="Times New Roman" w:hAnsi="Times New Roman" w:cs="Times New Roman"/>
-        </w:rPr>
-        <w:t xml:space="preserve"> at the optimal threshold, and Table 3.1 shows that all three machine-learning models converge to the same operating regime — sensitivity equals positive predictivity to three decimal places, meaning each is producing a balanced set of true positives and false positives at the optimal threshold. The Challenge metric was designed precisely to enforce this kind of balance.</w:t>
-      </w:r>
-    </w:p>
-    <w:p>
-      <w:pPr>
-        <w:pStyle w:val="BodyText"/>
-        <w:jc w:val="both"/>
-        <w:rPr>
-          <w:rFonts w:ascii="Times New Roman" w:hAnsi="Times New Roman" w:cs="Times New Roman"/>
-        </w:rPr>
-      </w:pPr>
-      <w:r>
-        <w:rPr>
-          <w:rFonts w:ascii="Times New Roman" w:hAnsi="Times New Roman" w:cs="Times New Roman"/>
-        </w:rPr>
-        <w:t>The Hosmer–</w:t>
-      </w:r>
-      <w:proofErr w:type="spellStart"/>
-      <w:r>
-        <w:rPr>
-          <w:rFonts w:ascii="Times New Roman" w:hAnsi="Times New Roman" w:cs="Times New Roman"/>
-        </w:rPr>
-        <w:t>Lemeshow</w:t>
-      </w:r>
-      <w:proofErr w:type="spellEnd"/>
-      <w:r>
-        <w:rPr>
-          <w:rFonts w:ascii="Times New Roman" w:hAnsi="Times New Roman" w:cs="Times New Roman"/>
-        </w:rPr>
-        <w:t xml:space="preserve"> statistic tells a different story. </w:t>
-      </w:r>
-      <w:proofErr w:type="spellStart"/>
-      <w:r>
-        <w:rPr>
-          <w:rFonts w:ascii="Times New Roman" w:hAnsi="Times New Roman" w:cs="Times New Roman"/>
-        </w:rPr>
-        <w:t>XGBoost</w:t>
-      </w:r>
-      <w:proofErr w:type="spellEnd"/>
-      <w:r>
-        <w:rPr>
-          <w:rFonts w:ascii="Times New Roman" w:hAnsi="Times New Roman" w:cs="Times New Roman"/>
-        </w:rPr>
-        <w:t xml:space="preserve"> is well-calibrated (HL-H = 37.67, close to the SAPS-I value of 35.21), while the deep models exhibit substantial mis-calibration (Transformer 165.17, TCN 205.78). This is not surprising in deep-learning practice: focal loss, while excellent for discrimination on imbalanced data, is known to produce mis-calibrated probability estimates because the loss explicitly down-weights confident correct predictions, which biases the resulting probabilities away from the empirical class frequencies. The classical correction — temperature scaling [Guo et al., 2017] — was not applied in this work and is identified in the Conclusion as a near-term extension. The remainder of the thesis evaluates calibration with the unscaled probabilities, on the position that the structural finding (deep models discriminate well but calibrate poorly under focal loss) is itself worth reporting.</w:t>
-      </w:r>
-    </w:p>
-    <w:p>
-      <w:pPr>
-        <w:pStyle w:val="Heading2"/>
-        <w:jc w:val="both"/>
-        <w:rPr>
-          <w:rFonts w:ascii="Times New Roman" w:hAnsi="Times New Roman" w:cs="Times New Roman"/>
-        </w:rPr>
-      </w:pPr>
-      <w:bookmarkStart w:id="97" w:name="time-step-shap-global-findings"/>
-      <w:bookmarkStart w:id="98" w:name="_Toc229867204"/>
-      <w:bookmarkEnd w:id="95"/>
       <w:r>
         <w:rPr>
           <w:rFonts w:ascii="Times New Roman" w:hAnsi="Times New Roman" w:cs="Times New Roman"/>
         </w:rPr>
         <w:t>3.3 Time-step SHAP — global findings</w:t>
       </w:r>
-      <w:bookmarkEnd w:id="98"/>
+      <w:bookmarkEnd w:id="97"/>
     </w:p>
     <w:p>
       <w:pPr>
@@ -12725,16 +12723,16 @@
           <w:rFonts w:ascii="Times New Roman" w:hAnsi="Times New Roman" w:cs="Times New Roman"/>
         </w:rPr>
       </w:pPr>
-      <w:bookmarkStart w:id="99" w:name="patient-level-case-studies"/>
-      <w:bookmarkStart w:id="100" w:name="_Toc229867205"/>
-      <w:bookmarkEnd w:id="97"/>
+      <w:bookmarkStart w:id="99" w:name="_Toc229867205"/>
+      <w:bookmarkStart w:id="100" w:name="patient-level-case-studies"/>
+      <w:bookmarkEnd w:id="98"/>
       <w:r>
         <w:rPr>
           <w:rFonts w:ascii="Times New Roman" w:hAnsi="Times New Roman" w:cs="Times New Roman"/>
         </w:rPr>
         <w:t>3.4 Patient-level case studies</w:t>
       </w:r>
-      <w:bookmarkEnd w:id="100"/>
+      <w:bookmarkEnd w:id="99"/>
     </w:p>
     <w:p>
       <w:pPr>
@@ -12948,9 +12946,9 @@
           <w:rFonts w:ascii="Times New Roman" w:hAnsi="Times New Roman" w:cs="Times New Roman"/>
         </w:rPr>
       </w:pPr>
-      <w:bookmarkStart w:id="101" w:name="attention-head-specialisation"/>
-      <w:bookmarkStart w:id="102" w:name="_Toc229867206"/>
-      <w:bookmarkEnd w:id="99"/>
+      <w:bookmarkStart w:id="101" w:name="_Toc229867206"/>
+      <w:bookmarkStart w:id="102" w:name="attention-head-specialisation"/>
+      <w:bookmarkEnd w:id="100"/>
       <w:r>
         <w:rPr>
           <w:rFonts w:ascii="Times New Roman" w:hAnsi="Times New Roman" w:cs="Times New Roman"/>
@@ -12964,7 +12962,7 @@
         </w:rPr>
         <w:t>specialisation</w:t>
       </w:r>
-      <w:bookmarkEnd w:id="102"/>
+      <w:bookmarkEnd w:id="101"/>
       <w:proofErr w:type="spellEnd"/>
     </w:p>
     <w:p>
@@ -13096,16 +13094,16 @@
           <w:rFonts w:ascii="Times New Roman" w:hAnsi="Times New Roman" w:cs="Times New Roman"/>
         </w:rPr>
       </w:pPr>
-      <w:bookmarkStart w:id="103" w:name="ablation-study-1"/>
-      <w:bookmarkStart w:id="104" w:name="_Toc229867207"/>
-      <w:bookmarkEnd w:id="101"/>
+      <w:bookmarkStart w:id="103" w:name="_Toc229867207"/>
+      <w:bookmarkStart w:id="104" w:name="ablation-study-1"/>
+      <w:bookmarkEnd w:id="102"/>
       <w:r>
         <w:rPr>
           <w:rFonts w:ascii="Times New Roman" w:hAnsi="Times New Roman" w:cs="Times New Roman"/>
         </w:rPr>
         <w:t>3.6 Ablation study</w:t>
       </w:r>
-      <w:bookmarkEnd w:id="104"/>
+      <w:bookmarkEnd w:id="103"/>
     </w:p>
     <w:p>
       <w:pPr>
@@ -14242,16 +14240,16 @@
           <w:rFonts w:ascii="Times New Roman" w:hAnsi="Times New Roman" w:cs="Times New Roman"/>
         </w:rPr>
       </w:pPr>
-      <w:bookmarkStart w:id="105" w:name="Xb25f63d545c6936f78848762ad237d1d5250691"/>
-      <w:bookmarkStart w:id="106" w:name="_Toc229867208"/>
-      <w:bookmarkEnd w:id="103"/>
+      <w:bookmarkStart w:id="105" w:name="_Toc229867208"/>
+      <w:bookmarkStart w:id="106" w:name="Xb25f63d545c6936f78848762ad237d1d5250691"/>
+      <w:bookmarkEnd w:id="104"/>
       <w:r>
         <w:rPr>
           <w:rFonts w:ascii="Times New Roman" w:hAnsi="Times New Roman" w:cs="Times New Roman"/>
         </w:rPr>
         <w:t>3.7 Clinical validation: SHAP–SOFA / SAPS-I concordance</w:t>
       </w:r>
-      <w:bookmarkEnd w:id="106"/>
+      <w:bookmarkEnd w:id="105"/>
     </w:p>
     <w:p>
       <w:pPr>
@@ -14885,16 +14883,16 @@
           <w:rFonts w:ascii="Times New Roman" w:hAnsi="Times New Roman" w:cs="Times New Roman"/>
         </w:rPr>
       </w:pPr>
-      <w:bookmarkStart w:id="107" w:name="limitations-and-threats-to-validity"/>
-      <w:bookmarkStart w:id="108" w:name="_Toc229867209"/>
-      <w:bookmarkEnd w:id="105"/>
+      <w:bookmarkStart w:id="107" w:name="_Toc229867209"/>
+      <w:bookmarkStart w:id="108" w:name="limitations-and-threats-to-validity"/>
+      <w:bookmarkEnd w:id="106"/>
       <w:r>
         <w:rPr>
           <w:rFonts w:ascii="Times New Roman" w:hAnsi="Times New Roman" w:cs="Times New Roman"/>
         </w:rPr>
         <w:t>3.8 Limitations and threats to validity</w:t>
       </w:r>
-      <w:bookmarkEnd w:id="108"/>
+      <w:bookmarkEnd w:id="107"/>
     </w:p>
     <w:p>
       <w:pPr>
@@ -15184,17 +15182,17 @@
           <w:rFonts w:ascii="Times New Roman" w:hAnsi="Times New Roman" w:cs="Times New Roman"/>
         </w:rPr>
       </w:pPr>
-      <w:bookmarkStart w:id="109" w:name="conclusion"/>
-      <w:bookmarkStart w:id="110" w:name="_Toc229867210"/>
+      <w:bookmarkStart w:id="109" w:name="_Toc229867210"/>
+      <w:bookmarkStart w:id="110" w:name="conclusion"/>
       <w:bookmarkEnd w:id="91"/>
-      <w:bookmarkEnd w:id="107"/>
+      <w:bookmarkEnd w:id="108"/>
       <w:r>
         <w:rPr>
           <w:rFonts w:ascii="Times New Roman" w:hAnsi="Times New Roman" w:cs="Times New Roman"/>
         </w:rPr>
         <w:t>CONCLUSION</w:t>
       </w:r>
-      <w:bookmarkEnd w:id="110"/>
+      <w:bookmarkEnd w:id="109"/>
     </w:p>
     <w:p>
       <w:pPr>
@@ -15233,8 +15231,8 @@
           <w:rFonts w:ascii="Times New Roman" w:hAnsi="Times New Roman" w:cs="Times New Roman"/>
         </w:rPr>
       </w:pPr>
-      <w:bookmarkStart w:id="111" w:name="summary-of-findings"/>
-      <w:bookmarkStart w:id="112" w:name="_Toc229867211"/>
+      <w:bookmarkStart w:id="111" w:name="_Toc229867211"/>
+      <w:bookmarkStart w:id="112" w:name="summary-of-findings"/>
       <w:r>
         <w:rPr>
           <w:rFonts w:ascii="Times New Roman" w:hAnsi="Times New Roman" w:cs="Times New Roman"/>
@@ -15242,7 +15240,7 @@
         <w:lastRenderedPageBreak/>
         <w:t>Summary of findings</w:t>
       </w:r>
-      <w:bookmarkEnd w:id="112"/>
+      <w:bookmarkEnd w:id="111"/>
     </w:p>
     <w:p>
       <w:pPr>
@@ -15423,16 +15421,16 @@
           <w:rFonts w:ascii="Times New Roman" w:hAnsi="Times New Roman" w:cs="Times New Roman"/>
         </w:rPr>
       </w:pPr>
-      <w:bookmarkStart w:id="113" w:name="contributions-to-knowledge"/>
-      <w:bookmarkStart w:id="114" w:name="_Toc229867212"/>
-      <w:bookmarkEnd w:id="111"/>
+      <w:bookmarkStart w:id="113" w:name="_Toc229867212"/>
+      <w:bookmarkStart w:id="114" w:name="contributions-to-knowledge"/>
+      <w:bookmarkEnd w:id="112"/>
       <w:r>
         <w:rPr>
           <w:rFonts w:ascii="Times New Roman" w:hAnsi="Times New Roman" w:cs="Times New Roman"/>
         </w:rPr>
         <w:t>Contributions to knowledge</w:t>
       </w:r>
-      <w:bookmarkEnd w:id="114"/>
+      <w:bookmarkEnd w:id="113"/>
     </w:p>
     <w:p>
       <w:pPr>
@@ -15550,16 +15548,16 @@
           <w:rFonts w:ascii="Times New Roman" w:hAnsi="Times New Roman" w:cs="Times New Roman"/>
         </w:rPr>
       </w:pPr>
-      <w:bookmarkStart w:id="115" w:name="practical-and-clinical-implications"/>
-      <w:bookmarkStart w:id="116" w:name="_Toc229867213"/>
-      <w:bookmarkEnd w:id="113"/>
+      <w:bookmarkStart w:id="115" w:name="_Toc229867213"/>
+      <w:bookmarkStart w:id="116" w:name="practical-and-clinical-implications"/>
+      <w:bookmarkEnd w:id="114"/>
       <w:r>
         <w:rPr>
           <w:rFonts w:ascii="Times New Roman" w:hAnsi="Times New Roman" w:cs="Times New Roman"/>
         </w:rPr>
         <w:t>Practical and clinical implications</w:t>
       </w:r>
-      <w:bookmarkEnd w:id="116"/>
+      <w:bookmarkEnd w:id="115"/>
     </w:p>
     <w:p>
       <w:pPr>
@@ -15699,16 +15697,16 @@
           <w:rFonts w:ascii="Times New Roman" w:hAnsi="Times New Roman" w:cs="Times New Roman"/>
         </w:rPr>
       </w:pPr>
-      <w:bookmarkStart w:id="117" w:name="open-questions-and-future-work"/>
-      <w:bookmarkStart w:id="118" w:name="_Toc229867214"/>
-      <w:bookmarkEnd w:id="115"/>
+      <w:bookmarkStart w:id="117" w:name="_Toc229867214"/>
+      <w:bookmarkStart w:id="118" w:name="open-questions-and-future-work"/>
+      <w:bookmarkEnd w:id="116"/>
       <w:r>
         <w:rPr>
           <w:rFonts w:ascii="Times New Roman" w:hAnsi="Times New Roman" w:cs="Times New Roman"/>
         </w:rPr>
         <w:t>Open questions and future work</w:t>
       </w:r>
-      <w:bookmarkEnd w:id="118"/>
+      <w:bookmarkEnd w:id="117"/>
     </w:p>
     <w:p>
       <w:pPr>
@@ -15896,66 +15894,66 @@
           <w:rFonts w:ascii="Times New Roman" w:hAnsi="Times New Roman" w:cs="Times New Roman"/>
         </w:rPr>
       </w:pPr>
-      <w:bookmarkStart w:id="119" w:name="final-remarks"/>
-      <w:bookmarkStart w:id="120" w:name="_Toc229867215"/>
-      <w:bookmarkEnd w:id="117"/>
+      <w:bookmarkStart w:id="119" w:name="_Toc229867215"/>
+      <w:bookmarkStart w:id="120" w:name="final-remarks"/>
+      <w:bookmarkEnd w:id="118"/>
       <w:r>
         <w:rPr>
           <w:rFonts w:ascii="Times New Roman" w:hAnsi="Times New Roman" w:cs="Times New Roman"/>
         </w:rPr>
         <w:t>Final remarks</w:t>
       </w:r>
+      <w:bookmarkEnd w:id="119"/>
+    </w:p>
+    <w:p>
+      <w:pPr>
+        <w:pStyle w:val="FirstParagraph"/>
+        <w:jc w:val="both"/>
+        <w:rPr>
+          <w:rFonts w:ascii="Times New Roman" w:hAnsi="Times New Roman" w:cs="Times New Roman"/>
+        </w:rPr>
+      </w:pPr>
+      <w:r>
+        <w:rPr>
+          <w:rFonts w:ascii="Times New Roman" w:hAnsi="Times New Roman" w:cs="Times New Roman"/>
+        </w:rPr>
+        <w:t>The history of intensive-care risk stratification, from APACHE I in 1981 to the present, is a history of trading interpretability for accuracy. Logistic regression on twelve variables yielded readily defensible numbers but discriminated weakly; deep sequence models on hundreds of variables and thousands of time steps discriminate well but defend their numbers poorly. The thesis argues that this trade-off is no longer forced. The combination of (a) a Transformer architecture that explicitly encodes missingness, (b) a SHAP procedure that returns attributions on the time × variable axis the clinician already uses, and (c) a quantitative validation against established severity scores, recovers most of the accuracy of the deep approach while restoring most of the interpretability of the classical approach. The remaining gap — calibration, prospective validation, causal interpretation — is the next decade of work.</w:t>
+      </w:r>
+    </w:p>
+    <w:p>
+      <w:pPr>
+        <w:pStyle w:val="BodyText"/>
+        <w:jc w:val="both"/>
+        <w:rPr>
+          <w:rFonts w:ascii="Times New Roman" w:hAnsi="Times New Roman" w:cs="Times New Roman"/>
+        </w:rPr>
+      </w:pPr>
+      <w:r>
+        <w:rPr>
+          <w:rFonts w:ascii="Times New Roman" w:hAnsi="Times New Roman" w:cs="Times New Roman"/>
+        </w:rPr>
+        <w:t>The contribution that this MS thesis hopes to defend is not a state-of-the-art number on a benchmark, although the numbers are competitive. It is the demonstration, on a public cohort and with disclosed seeds, that an explanation procedure for ICU mortality prediction can be both temporally resolved and clinically validated at the same time. That demonstration, if it survives external replication, is one small step toward the kind of model an attending physician can argue with at the bedside.</w:t>
+      </w:r>
+    </w:p>
+    <w:p>
+      <w:pPr>
+        <w:pStyle w:val="Heading1"/>
+        <w:jc w:val="both"/>
+        <w:rPr>
+          <w:rFonts w:ascii="Times New Roman" w:hAnsi="Times New Roman" w:cs="Times New Roman"/>
+        </w:rPr>
+      </w:pPr>
+      <w:bookmarkStart w:id="121" w:name="_Toc229867216"/>
+      <w:bookmarkStart w:id="122" w:name="references"/>
+      <w:bookmarkEnd w:id="110"/>
       <w:bookmarkEnd w:id="120"/>
-    </w:p>
-    <w:p>
-      <w:pPr>
-        <w:pStyle w:val="FirstParagraph"/>
-        <w:jc w:val="both"/>
-        <w:rPr>
-          <w:rFonts w:ascii="Times New Roman" w:hAnsi="Times New Roman" w:cs="Times New Roman"/>
-        </w:rPr>
-      </w:pPr>
-      <w:r>
-        <w:rPr>
-          <w:rFonts w:ascii="Times New Roman" w:hAnsi="Times New Roman" w:cs="Times New Roman"/>
-        </w:rPr>
-        <w:t>The history of intensive-care risk stratification, from APACHE I in 1981 to the present, is a history of trading interpretability for accuracy. Logistic regression on twelve variables yielded readily defensible numbers but discriminated weakly; deep sequence models on hundreds of variables and thousands of time steps discriminate well but defend their numbers poorly. The thesis argues that this trade-off is no longer forced. The combination of (a) a Transformer architecture that explicitly encodes missingness, (b) a SHAP procedure that returns attributions on the time × variable axis the clinician already uses, and (c) a quantitative validation against established severity scores, recovers most of the accuracy of the deep approach while restoring most of the interpretability of the classical approach. The remaining gap — calibration, prospective validation, causal interpretation — is the next decade of work.</w:t>
-      </w:r>
-    </w:p>
-    <w:p>
-      <w:pPr>
-        <w:pStyle w:val="BodyText"/>
-        <w:jc w:val="both"/>
-        <w:rPr>
-          <w:rFonts w:ascii="Times New Roman" w:hAnsi="Times New Roman" w:cs="Times New Roman"/>
-        </w:rPr>
-      </w:pPr>
-      <w:r>
-        <w:rPr>
-          <w:rFonts w:ascii="Times New Roman" w:hAnsi="Times New Roman" w:cs="Times New Roman"/>
-        </w:rPr>
-        <w:t>The contribution that this MS thesis hopes to defend is not a state-of-the-art number on a benchmark, although the numbers are competitive. It is the demonstration, on a public cohort and with disclosed seeds, that an explanation procedure for ICU mortality prediction can be both temporally resolved and clinically validated at the same time. That demonstration, if it survives external replication, is one small step toward the kind of model an attending physician can argue with at the bedside.</w:t>
-      </w:r>
-    </w:p>
-    <w:p>
-      <w:pPr>
-        <w:pStyle w:val="Heading1"/>
-        <w:jc w:val="both"/>
-        <w:rPr>
-          <w:rFonts w:ascii="Times New Roman" w:hAnsi="Times New Roman" w:cs="Times New Roman"/>
-        </w:rPr>
-      </w:pPr>
-      <w:bookmarkStart w:id="121" w:name="references"/>
-      <w:bookmarkStart w:id="122" w:name="_Toc229867216"/>
-      <w:bookmarkEnd w:id="109"/>
-      <w:bookmarkEnd w:id="119"/>
       <w:r>
         <w:rPr>
           <w:rFonts w:ascii="Times New Roman" w:hAnsi="Times New Roman" w:cs="Times New Roman"/>
         </w:rPr>
         <w:t>REFERENCES</w:t>
       </w:r>
-      <w:bookmarkEnd w:id="122"/>
+      <w:bookmarkEnd w:id="121"/>
     </w:p>
     <w:p>
       <w:pPr>
@@ -18457,16 +18455,16 @@
           <w:rFonts w:ascii="Times New Roman" w:hAnsi="Times New Roman" w:cs="Times New Roman"/>
         </w:rPr>
       </w:pPr>
-      <w:bookmarkStart w:id="123" w:name="appendices"/>
-      <w:bookmarkStart w:id="124" w:name="_Toc229867217"/>
-      <w:bookmarkEnd w:id="121"/>
+      <w:bookmarkStart w:id="123" w:name="_Toc229867217"/>
+      <w:bookmarkStart w:id="124" w:name="appendices"/>
+      <w:bookmarkEnd w:id="122"/>
       <w:r>
         <w:rPr>
           <w:rFonts w:ascii="Times New Roman" w:hAnsi="Times New Roman" w:cs="Times New Roman"/>
         </w:rPr>
         <w:t>APPENDICES</w:t>
       </w:r>
-      <w:bookmarkEnd w:id="124"/>
+      <w:bookmarkEnd w:id="123"/>
     </w:p>
     <w:p>
       <w:pPr>
@@ -18476,15 +18474,15 @@
           <w:rFonts w:ascii="Times New Roman" w:hAnsi="Times New Roman" w:cs="Times New Roman"/>
         </w:rPr>
       </w:pPr>
-      <w:bookmarkStart w:id="125" w:name="appendix-a-variable-list"/>
-      <w:bookmarkStart w:id="126" w:name="_Toc229867218"/>
+      <w:bookmarkStart w:id="125" w:name="_Toc229867218"/>
+      <w:bookmarkStart w:id="126" w:name="appendix-a-variable-list"/>
       <w:r>
         <w:rPr>
           <w:rFonts w:ascii="Times New Roman" w:hAnsi="Times New Roman" w:cs="Times New Roman"/>
         </w:rPr>
         <w:t>Appendix A — Variable list</w:t>
       </w:r>
-      <w:bookmarkEnd w:id="126"/>
+      <w:bookmarkEnd w:id="125"/>
     </w:p>
     <w:p>
       <w:pPr>
@@ -22534,16 +22532,16 @@
           <w:rFonts w:ascii="Times New Roman" w:hAnsi="Times New Roman" w:cs="Times New Roman"/>
         </w:rPr>
       </w:pPr>
-      <w:bookmarkStart w:id="127" w:name="appendix-b-full-ablation-table"/>
-      <w:bookmarkStart w:id="128" w:name="_Toc229867219"/>
-      <w:bookmarkEnd w:id="125"/>
+      <w:bookmarkStart w:id="127" w:name="_Toc229867219"/>
+      <w:bookmarkStart w:id="128" w:name="appendix-b-full-ablation-table"/>
+      <w:bookmarkEnd w:id="126"/>
       <w:r>
         <w:rPr>
           <w:rFonts w:ascii="Times New Roman" w:hAnsi="Times New Roman" w:cs="Times New Roman"/>
         </w:rPr>
         <w:t>Appendix B — Full ablation table</w:t>
       </w:r>
-      <w:bookmarkEnd w:id="128"/>
+      <w:bookmarkEnd w:id="127"/>
     </w:p>
     <w:tbl>
       <w:tblPr>
@@ -24248,16 +24246,16 @@
           <w:rFonts w:ascii="Times New Roman" w:hAnsi="Times New Roman" w:cs="Times New Roman"/>
         </w:rPr>
       </w:pPr>
-      <w:bookmarkStart w:id="129" w:name="X250284d3b0f21dedef33b19d3411bd07717ebf0"/>
-      <w:bookmarkStart w:id="130" w:name="_Toc229867220"/>
-      <w:bookmarkEnd w:id="127"/>
+      <w:bookmarkStart w:id="129" w:name="_Toc229867220"/>
+      <w:bookmarkStart w:id="130" w:name="X250284d3b0f21dedef33b19d3411bd07717ebf0"/>
+      <w:bookmarkEnd w:id="128"/>
       <w:r>
         <w:rPr>
           <w:rFonts w:ascii="Times New Roman" w:hAnsi="Times New Roman" w:cs="Times New Roman"/>
         </w:rPr>
         <w:t>Appendix C — Hyperparameters of the three model families</w:t>
       </w:r>
-      <w:bookmarkEnd w:id="130"/>
+      <w:bookmarkEnd w:id="129"/>
     </w:p>
     <w:p>
       <w:pPr>
@@ -24478,16 +24476,16 @@
           <w:rFonts w:ascii="Times New Roman" w:hAnsi="Times New Roman" w:cs="Times New Roman"/>
         </w:rPr>
       </w:pPr>
-      <w:bookmarkStart w:id="131" w:name="appendix-d-figure-pack"/>
-      <w:bookmarkStart w:id="132" w:name="_Toc229867221"/>
-      <w:bookmarkEnd w:id="129"/>
+      <w:bookmarkStart w:id="131" w:name="_Toc229867221"/>
+      <w:bookmarkStart w:id="132" w:name="appendix-d-figure-pack"/>
+      <w:bookmarkEnd w:id="130"/>
       <w:r>
         <w:rPr>
           <w:rFonts w:ascii="Times New Roman" w:hAnsi="Times New Roman" w:cs="Times New Roman"/>
         </w:rPr>
         <w:t>Appendix D — Figure pack</w:t>
       </w:r>
-      <w:bookmarkEnd w:id="132"/>
+      <w:bookmarkEnd w:id="131"/>
     </w:p>
     <w:p>
       <w:pPr>
@@ -24720,9 +24718,9 @@
           <w:rFonts w:ascii="Times New Roman" w:hAnsi="Times New Roman" w:cs="Times New Roman"/>
         </w:rPr>
       </w:pPr>
-      <w:bookmarkStart w:id="133" w:name="appendix-e-reproducibility-checklist"/>
-      <w:bookmarkStart w:id="134" w:name="_Toc229867222"/>
-      <w:bookmarkEnd w:id="131"/>
+      <w:bookmarkStart w:id="133" w:name="_Toc229867222"/>
+      <w:bookmarkStart w:id="134" w:name="appendix-e-reproducibility-checklist"/>
+      <w:bookmarkEnd w:id="132"/>
       <w:r>
         <w:rPr>
           <w:rFonts w:ascii="Times New Roman" w:hAnsi="Times New Roman" w:cs="Times New Roman"/>
@@ -24730,7 +24728,7 @@
         <w:lastRenderedPageBreak/>
         <w:t>Appendix E — Reproducibility checklist</w:t>
       </w:r>
-      <w:bookmarkEnd w:id="134"/>
+      <w:bookmarkEnd w:id="133"/>
     </w:p>
     <w:p>
       <w:pPr>
@@ -25248,8 +25246,8 @@
         </w:rPr>
         <w:t xml:space="preserve"> → TCN → Transformer → SHAP → clinical validation → ablation → final comparison → figures in that order. Total wall-clock time on the reference hardware is approximately 35 minutes.</w:t>
       </w:r>
-      <w:bookmarkEnd w:id="123"/>
-      <w:bookmarkEnd w:id="133"/>
+      <w:bookmarkEnd w:id="124"/>
+      <w:bookmarkEnd w:id="134"/>
     </w:p>
     <w:sectPr>
       <w:footnotePr>

</xml_diff>